<commit_message>
content: refresh résumé PDF and DOCX
Adds ClickHouse to the databases skill line so it matches the bullets
that already reference it, and keeps the filename as Resume.pdf, which
is what both links in index.html point at.

Co-Authored-By: Claude Opus 5 (1M context) <noreply@anthropic.com>
</commit_message>
<xml_diff>
--- a/Resume.docx
+++ b/Resume.docx
@@ -76,15 +76,7 @@
           <w:sz w:val="18"/>
           <w:szCs w:val="18"/>
         </w:rPr>
-        <w:t>SITE RELIABILITY ENGINEER</w:t>
-      </w:r>
-      <w:r>
-        <w:rPr>
-          <w:rFonts w:ascii="Arial" w:eastAsia="Arial" w:hAnsi="Arial" w:cs="Arial"/>
-          <w:sz w:val="18"/>
-          <w:szCs w:val="18"/>
-        </w:rPr>
-        <w:t xml:space="preserve"> </w:t>
+        <w:t xml:space="preserve">SITE RELIABILITY ENGINEER </w:t>
       </w:r>
       <w:r>
         <w:rPr>
@@ -218,61 +210,41 @@
         </w:rPr>
         <w:t xml:space="preserve">▪ </w:t>
       </w:r>
-      <w:r>
-        <w:fldChar w:fldCharType="begin"/>
-      </w:r>
-      <w:r>
-        <w:instrText xml:space="preserve">HYPERLINK "https://www.linkedin.com/in/farhaanpatel/" \h </w:instrText>
-      </w:r>
-      <w:r>
-        <w:fldChar w:fldCharType="separate"/>
-      </w:r>
+      <w:hyperlink r:id="rId8">
+        <w:r>
+          <w:rPr>
+            <w:color w:val="1155CC"/>
+            <w:sz w:val="22"/>
+            <w:szCs w:val="22"/>
+          </w:rPr>
+          <w:t>LinkedIn</w:t>
+        </w:r>
+      </w:hyperlink>
       <w:r>
         <w:rPr>
           <w:color w:val="1155CC"/>
           <w:sz w:val="22"/>
           <w:szCs w:val="22"/>
         </w:rPr>
-        <w:t>LinkedIn</w:t>
-      </w:r>
-      <w:r>
-        <w:fldChar w:fldCharType="end"/>
-      </w:r>
-      <w:r>
-        <w:rPr>
-          <w:color w:val="1155CC"/>
+        <w:t xml:space="preserve"> </w:t>
+      </w:r>
+      <w:r>
+        <w:rPr>
           <w:sz w:val="22"/>
           <w:szCs w:val="22"/>
         </w:rPr>
-        <w:t xml:space="preserve"> </w:t>
-      </w:r>
-      <w:r>
-        <w:rPr>
-          <w:sz w:val="22"/>
-          <w:szCs w:val="22"/>
-        </w:rPr>
         <w:t xml:space="preserve">▪ </w:t>
       </w:r>
-      <w:r>
-        <w:fldChar w:fldCharType="begin"/>
-      </w:r>
-      <w:r>
-        <w:instrText xml:space="preserve">HYPERLINK "https://github.com/PatelFarhaan" \h </w:instrText>
-      </w:r>
-      <w:r>
-        <w:fldChar w:fldCharType="separate"/>
-      </w:r>
-      <w:r>
-        <w:rPr>
-          <w:color w:val="1155CC"/>
-          <w:sz w:val="22"/>
-          <w:szCs w:val="22"/>
-        </w:rPr>
-        <w:t>GitHub</w:t>
-      </w:r>
-      <w:r>
-        <w:fldChar w:fldCharType="end"/>
-      </w:r>
+      <w:hyperlink r:id="rId9">
+        <w:r>
+          <w:rPr>
+            <w:color w:val="1155CC"/>
+            <w:sz w:val="22"/>
+            <w:szCs w:val="22"/>
+          </w:rPr>
+          <w:t>GitHub</w:t>
+        </w:r>
+      </w:hyperlink>
     </w:p>
     <w:p>
       <w:pPr>
@@ -529,28 +501,75 @@
         <w:spacing w:after="20"/>
         <w:ind w:left="270"/>
         <w:rPr>
-          <w:rFonts w:ascii="Arial" w:eastAsia="Arial" w:hAnsi="Arial" w:cs="Arial"/>
-          <w:sz w:val="18"/>
-          <w:szCs w:val="18"/>
-        </w:rPr>
-      </w:pPr>
-      <w:r>
-        <w:rPr>
-          <w:rFonts w:ascii="Arial" w:eastAsia="Arial" w:hAnsi="Arial" w:cs="Arial"/>
-          <w:b/>
-          <w:bCs/>
-          <w:sz w:val="18"/>
-          <w:szCs w:val="18"/>
-        </w:rPr>
-        <w:t xml:space="preserve">Databases: </w:t>
-      </w:r>
-      <w:r>
-        <w:rPr>
-          <w:rFonts w:ascii="Arial" w:eastAsia="Arial" w:hAnsi="Arial" w:cs="Arial"/>
-          <w:sz w:val="18"/>
-          <w:szCs w:val="18"/>
-        </w:rPr>
-        <w:t>PostgreSQL, MongoDB, DynamoDB, MySQL, Redis, Neo4j, Amazon Redshift</w:t>
+          <w:sz w:val="18"/>
+          <w:szCs w:val="18"/>
+        </w:rPr>
+      </w:pPr>
+      <w:r>
+        <w:rPr>
+          <w:rFonts w:ascii="Arial" w:eastAsia="Arial" w:hAnsi="Arial" w:cs="Arial"/>
+          <w:b/>
+          <w:bCs/>
+          <w:sz w:val="18"/>
+          <w:szCs w:val="18"/>
+        </w:rPr>
+        <w:t>Infrastructure as Code (</w:t>
+      </w:r>
+      <w:proofErr w:type="spellStart"/>
+      <w:r>
+        <w:rPr>
+          <w:rFonts w:ascii="Arial" w:eastAsia="Arial" w:hAnsi="Arial" w:cs="Arial"/>
+          <w:b/>
+          <w:bCs/>
+          <w:sz w:val="18"/>
+          <w:szCs w:val="18"/>
+        </w:rPr>
+        <w:t>IaC</w:t>
+      </w:r>
+      <w:proofErr w:type="spellEnd"/>
+      <w:r>
+        <w:rPr>
+          <w:rFonts w:ascii="Arial" w:eastAsia="Arial" w:hAnsi="Arial" w:cs="Arial"/>
+          <w:b/>
+          <w:bCs/>
+          <w:sz w:val="18"/>
+          <w:szCs w:val="18"/>
+        </w:rPr>
+        <w:t xml:space="preserve">): </w:t>
+      </w:r>
+      <w:r>
+        <w:rPr>
+          <w:rFonts w:ascii="Arial" w:eastAsia="Arial" w:hAnsi="Arial" w:cs="Arial"/>
+          <w:sz w:val="18"/>
+          <w:szCs w:val="18"/>
+        </w:rPr>
+        <w:t xml:space="preserve">Terraform, </w:t>
+      </w:r>
+      <w:proofErr w:type="spellStart"/>
+      <w:r>
+        <w:rPr>
+          <w:rFonts w:ascii="Arial" w:eastAsia="Arial" w:hAnsi="Arial" w:cs="Arial"/>
+          <w:sz w:val="18"/>
+          <w:szCs w:val="18"/>
+        </w:rPr>
+        <w:t>Terragrunt</w:t>
+      </w:r>
+      <w:proofErr w:type="spellEnd"/>
+      <w:r>
+        <w:rPr>
+          <w:rFonts w:ascii="Arial" w:eastAsia="Arial" w:hAnsi="Arial" w:cs="Arial"/>
+          <w:sz w:val="18"/>
+          <w:szCs w:val="18"/>
+        </w:rPr>
+        <w:t xml:space="preserve">, </w:t>
+      </w:r>
+      <w:r>
+        <w:rPr>
+          <w:rFonts w:ascii="Arial" w:eastAsia="Arial" w:hAnsi="Arial" w:cs="Arial"/>
+          <w:sz w:val="18"/>
+          <w:szCs w:val="18"/>
+        </w:rPr>
+        <w:t>Ansible, CloudFormation, Helm Charts</w:t>
       </w:r>
     </w:p>
     <w:p>
@@ -574,37 +593,33 @@
           <w:sz w:val="18"/>
           <w:szCs w:val="18"/>
         </w:rPr>
-        <w:t>Infrastructure as Code (</w:t>
+        <w:t>Frameworks &amp; Tools:</w:t>
+      </w:r>
+      <w:r>
+        <w:rPr>
+          <w:rFonts w:ascii="Arial" w:eastAsia="Arial" w:hAnsi="Arial" w:cs="Arial"/>
+          <w:sz w:val="18"/>
+          <w:szCs w:val="18"/>
+        </w:rPr>
+        <w:t xml:space="preserve"> </w:t>
       </w:r>
       <w:proofErr w:type="spellStart"/>
       <w:r>
         <w:rPr>
           <w:rFonts w:ascii="Arial" w:eastAsia="Arial" w:hAnsi="Arial" w:cs="Arial"/>
-          <w:b/>
-          <w:bCs/>
-          <w:sz w:val="18"/>
-          <w:szCs w:val="18"/>
-        </w:rPr>
-        <w:t>IaC</w:t>
+          <w:sz w:val="18"/>
+          <w:szCs w:val="18"/>
+        </w:rPr>
+        <w:t>FastAPI</w:t>
       </w:r>
       <w:proofErr w:type="spellEnd"/>
       <w:r>
         <w:rPr>
           <w:rFonts w:ascii="Arial" w:eastAsia="Arial" w:hAnsi="Arial" w:cs="Arial"/>
-          <w:b/>
-          <w:bCs/>
-          <w:sz w:val="18"/>
-          <w:szCs w:val="18"/>
-        </w:rPr>
-        <w:t xml:space="preserve">): </w:t>
-      </w:r>
-      <w:r>
-        <w:rPr>
-          <w:rFonts w:ascii="Arial" w:eastAsia="Arial" w:hAnsi="Arial" w:cs="Arial"/>
-          <w:sz w:val="18"/>
-          <w:szCs w:val="18"/>
-        </w:rPr>
-        <w:t xml:space="preserve">Terraform, </w:t>
+          <w:sz w:val="18"/>
+          <w:szCs w:val="18"/>
+        </w:rPr>
+        <w:t xml:space="preserve">, Flask, Django, React, Next.js, </w:t>
       </w:r>
       <w:proofErr w:type="spellStart"/>
       <w:r>
@@ -613,7 +628,7 @@
           <w:sz w:val="18"/>
           <w:szCs w:val="18"/>
         </w:rPr>
-        <w:t>Terragrunt</w:t>
+        <w:t>Streamlit</w:t>
       </w:r>
       <w:proofErr w:type="spellEnd"/>
       <w:r>
@@ -622,15 +637,7 @@
           <w:sz w:val="18"/>
           <w:szCs w:val="18"/>
         </w:rPr>
-        <w:t xml:space="preserve">, </w:t>
-      </w:r>
-      <w:r>
-        <w:rPr>
-          <w:rFonts w:ascii="Arial" w:eastAsia="Arial" w:hAnsi="Arial" w:cs="Arial"/>
-          <w:sz w:val="18"/>
-          <w:szCs w:val="18"/>
-        </w:rPr>
-        <w:t>Ansible, CloudFormation, Helm Charts</w:t>
+        <w:t>, Celery, REST APIs</w:t>
       </w:r>
     </w:p>
     <w:p>
@@ -654,15 +661,15 @@
           <w:sz w:val="18"/>
           <w:szCs w:val="18"/>
         </w:rPr>
-        <w:t>Frameworks &amp; Tools:</w:t>
-      </w:r>
-      <w:r>
-        <w:rPr>
-          <w:rFonts w:ascii="Arial" w:eastAsia="Arial" w:hAnsi="Arial" w:cs="Arial"/>
-          <w:sz w:val="18"/>
-          <w:szCs w:val="18"/>
-        </w:rPr>
-        <w:t xml:space="preserve"> </w:t>
+        <w:t xml:space="preserve">Databases: </w:t>
+      </w:r>
+      <w:r>
+        <w:rPr>
+          <w:rFonts w:ascii="Arial" w:eastAsia="Arial" w:hAnsi="Arial" w:cs="Arial"/>
+          <w:sz w:val="18"/>
+          <w:szCs w:val="18"/>
+        </w:rPr>
+        <w:t xml:space="preserve">PostgreSQL, MongoDB, DynamoDB, MySQL, Redis, Neo4j, Amazon Redshift, </w:t>
       </w:r>
       <w:proofErr w:type="spellStart"/>
       <w:r>
@@ -671,35 +678,9 @@
           <w:sz w:val="18"/>
           <w:szCs w:val="18"/>
         </w:rPr>
-        <w:t>FastAPI</w:t>
+        <w:t>Clickhouse</w:t>
       </w:r>
       <w:proofErr w:type="spellEnd"/>
-      <w:r>
-        <w:rPr>
-          <w:rFonts w:ascii="Arial" w:eastAsia="Arial" w:hAnsi="Arial" w:cs="Arial"/>
-          <w:sz w:val="18"/>
-          <w:szCs w:val="18"/>
-        </w:rPr>
-        <w:t xml:space="preserve">, Flask, Django, React, Next.js, </w:t>
-      </w:r>
-      <w:proofErr w:type="spellStart"/>
-      <w:r>
-        <w:rPr>
-          <w:rFonts w:ascii="Arial" w:eastAsia="Arial" w:hAnsi="Arial" w:cs="Arial"/>
-          <w:sz w:val="18"/>
-          <w:szCs w:val="18"/>
-        </w:rPr>
-        <w:t>Streamlit</w:t>
-      </w:r>
-      <w:proofErr w:type="spellEnd"/>
-      <w:r>
-        <w:rPr>
-          <w:rFonts w:ascii="Arial" w:eastAsia="Arial" w:hAnsi="Arial" w:cs="Arial"/>
-          <w:sz w:val="18"/>
-          <w:szCs w:val="18"/>
-        </w:rPr>
-        <w:t>, Celery, REST APIs</w:t>
-      </w:r>
     </w:p>
     <w:p>
       <w:pPr>
@@ -1274,23 +1255,7 @@
           <w:sz w:val="18"/>
           <w:szCs w:val="18"/>
         </w:rPr>
-        <w:t>Engineering owner (DRI) for Roku's artifact platform - Artifactory, Xray, Distribution and Edge - accountable for architecture, upgrades, reliability</w:t>
-      </w:r>
-      <w:r>
-        <w:rPr>
-          <w:rFonts w:ascii="Arial" w:hAnsi="Arial" w:cs="Arial"/>
-          <w:sz w:val="18"/>
-          <w:szCs w:val="18"/>
-        </w:rPr>
-        <w:t xml:space="preserve"> </w:t>
-      </w:r>
-      <w:r>
-        <w:rPr>
-          <w:rFonts w:ascii="Arial" w:hAnsi="Arial" w:cs="Arial"/>
-          <w:sz w:val="18"/>
-          <w:szCs w:val="18"/>
-        </w:rPr>
-        <w:t>and roadmap across the services every engineering team depends on to build and ship.</w:t>
+        <w:t>Engineering owner (DRI) for Roku's artifact platform - Artifactory, Xray, Distribution and Edge - accountable for architecture, upgrades, reliability and roadmap across the services every engineering team depends on to build and ship.</w:t>
       </w:r>
     </w:p>
     <w:p>
@@ -1313,39 +1278,7 @@
           <w:sz w:val="18"/>
           <w:szCs w:val="18"/>
         </w:rPr>
-        <w:t>Led a company-wide artifact platform migration - scoped as a 2-year program, delivered in one quarter - moving 58 engineering teams and 85</w:t>
-      </w:r>
-      <w:r>
-        <w:rPr>
-          <w:rFonts w:ascii="Arial" w:hAnsi="Arial" w:cs="Arial"/>
-          <w:sz w:val="18"/>
-          <w:szCs w:val="18"/>
-        </w:rPr>
-        <w:t xml:space="preserve"> </w:t>
-      </w:r>
-      <w:r>
-        <w:rPr>
-          <w:rFonts w:ascii="Arial" w:hAnsi="Arial" w:cs="Arial"/>
-          <w:sz w:val="18"/>
-          <w:szCs w:val="18"/>
-        </w:rPr>
-        <w:t>service accounts onto project-scoped repositories with isolated RBAC, using virtual-repository passthrough so teams switched publishing</w:t>
-      </w:r>
-      <w:r>
-        <w:rPr>
-          <w:rFonts w:ascii="Arial" w:hAnsi="Arial" w:cs="Arial"/>
-          <w:sz w:val="18"/>
-          <w:szCs w:val="18"/>
-        </w:rPr>
-        <w:t xml:space="preserve"> </w:t>
-      </w:r>
-      <w:r>
-        <w:rPr>
-          <w:rFonts w:ascii="Arial" w:hAnsi="Arial" w:cs="Arial"/>
-          <w:sz w:val="18"/>
-          <w:szCs w:val="18"/>
-        </w:rPr>
-        <w:t>endpoints with zero downtime and no artifact copying. Recognized with the company Engineering Spotlight award.</w:t>
+        <w:t>Led a company-wide artifact platform migration - scoped as a 2-year program, delivered in one quarter - moving 58 engineering teams and 85 service accounts onto project-scoped repositories with isolated RBAC, using virtual-repository passthrough so teams switched publishing endpoints with zero downtime and no artifact copying. Recognized with the company Engineering Spotlight award.</w:t>
       </w:r>
     </w:p>
     <w:p>
@@ -1422,23 +1355,7 @@
           <w:sz w:val="18"/>
           <w:szCs w:val="18"/>
         </w:rPr>
-        <w:t>, onboarded every owned service, and moved continuous</w:t>
-      </w:r>
-      <w:r>
-        <w:rPr>
-          <w:rFonts w:ascii="Arial" w:hAnsi="Arial" w:cs="Arial"/>
-          <w:sz w:val="18"/>
-          <w:szCs w:val="18"/>
-        </w:rPr>
-        <w:t xml:space="preserve"> </w:t>
-      </w:r>
-      <w:r>
-        <w:rPr>
-          <w:rFonts w:ascii="Arial" w:hAnsi="Arial" w:cs="Arial"/>
-          <w:sz w:val="18"/>
-          <w:szCs w:val="18"/>
-        </w:rPr>
-        <w:t xml:space="preserve">delivery out of GitLab CI into declarative </w:t>
+        <w:t xml:space="preserve">, onboarded every owned service, and moved continuous delivery out of GitLab CI into declarative </w:t>
       </w:r>
       <w:proofErr w:type="spellStart"/>
       <w:r>
@@ -1456,23 +1373,7 @@
           <w:sz w:val="18"/>
           <w:szCs w:val="18"/>
         </w:rPr>
-        <w:t xml:space="preserve"> - cutting release lead time, making rollback a git revert, and surfacing configuration</w:t>
-      </w:r>
-      <w:r>
-        <w:rPr>
-          <w:rFonts w:ascii="Arial" w:hAnsi="Arial" w:cs="Arial"/>
-          <w:sz w:val="18"/>
-          <w:szCs w:val="18"/>
-        </w:rPr>
-        <w:t xml:space="preserve"> </w:t>
-      </w:r>
-      <w:r>
-        <w:rPr>
-          <w:rFonts w:ascii="Arial" w:hAnsi="Arial" w:cs="Arial"/>
-          <w:sz w:val="18"/>
-          <w:szCs w:val="18"/>
-        </w:rPr>
-        <w:t>drift in real time rather than at the next incident.</w:t>
+        <w:t xml:space="preserve"> - cutting release lead time, making rollback a git revert, and surfacing configuration drift in real time rather than at the next incident.</w:t>
       </w:r>
     </w:p>
     <w:p>
@@ -1495,55 +1396,7 @@
           <w:sz w:val="18"/>
           <w:szCs w:val="18"/>
         </w:rPr>
-        <w:t>Architected a partner-facing artifact distribution platform giving external silicon partners a public, isolated endpoint for firmware and container</w:t>
-      </w:r>
-      <w:r>
-        <w:rPr>
-          <w:rFonts w:ascii="Arial" w:hAnsi="Arial" w:cs="Arial"/>
-          <w:sz w:val="18"/>
-          <w:szCs w:val="18"/>
-        </w:rPr>
-        <w:t xml:space="preserve"> </w:t>
-      </w:r>
-      <w:r>
-        <w:rPr>
-          <w:rFonts w:ascii="Arial" w:hAnsi="Arial" w:cs="Arial"/>
-          <w:sz w:val="18"/>
-          <w:szCs w:val="18"/>
-        </w:rPr>
-        <w:t xml:space="preserve">artifacts - HA Kubernetes edge, SSO-gated console, per-partner scoped tokens and release-bundle promotion from the primary cluster </w:t>
-      </w:r>
-      <w:r>
-        <w:rPr>
-          <w:rFonts w:ascii="Arial" w:hAnsi="Arial" w:cs="Arial"/>
-          <w:sz w:val="18"/>
-          <w:szCs w:val="18"/>
-        </w:rPr>
-        <w:t>–</w:t>
-      </w:r>
-      <w:r>
-        <w:rPr>
-          <w:rFonts w:ascii="Arial" w:hAnsi="Arial" w:cs="Arial"/>
-          <w:sz w:val="18"/>
-          <w:szCs w:val="18"/>
-        </w:rPr>
-        <w:t xml:space="preserve"> and</w:t>
-      </w:r>
-      <w:r>
-        <w:rPr>
-          <w:rFonts w:ascii="Arial" w:hAnsi="Arial" w:cs="Arial"/>
-          <w:sz w:val="18"/>
-          <w:szCs w:val="18"/>
-        </w:rPr>
-        <w:t xml:space="preserve"> </w:t>
-      </w:r>
-      <w:r>
-        <w:rPr>
-          <w:rFonts w:ascii="Arial" w:hAnsi="Arial" w:cs="Arial"/>
-          <w:sz w:val="18"/>
-          <w:szCs w:val="18"/>
-        </w:rPr>
-        <w:t>drove the design, network topology and cost model through architecture review.</w:t>
+        <w:t>Architected a partner-facing artifact distribution platform giving external silicon partners a public, isolated endpoint for firmware and container artifacts - HA Kubernetes edge, SSO-gated console, per-partner scoped tokens and release-bundle promotion from the primary cluster – and drove the design, network topology and cost model through architecture review.</w:t>
       </w:r>
     </w:p>
     <w:p>
@@ -1584,23 +1437,7 @@
           <w:sz w:val="18"/>
           <w:szCs w:val="18"/>
         </w:rPr>
-        <w:t xml:space="preserve"> with AWS Cost and Usage Reports and spot</w:t>
-      </w:r>
-      <w:r>
-        <w:rPr>
-          <w:rFonts w:ascii="Arial" w:hAnsi="Arial" w:cs="Arial"/>
-          <w:sz w:val="18"/>
-          <w:szCs w:val="18"/>
-        </w:rPr>
-        <w:t xml:space="preserve"> </w:t>
-      </w:r>
-      <w:r>
-        <w:rPr>
-          <w:rFonts w:ascii="Arial" w:hAnsi="Arial" w:cs="Arial"/>
-          <w:sz w:val="18"/>
-          <w:szCs w:val="18"/>
-        </w:rPr>
-        <w:t xml:space="preserve">pricing feeds through Glue and Athena, then acting on it - integrating </w:t>
+        <w:t xml:space="preserve"> with AWS Cost and Usage Reports and spot pricing feeds through Glue and Athena, then acting on it - integrating </w:t>
       </w:r>
       <w:proofErr w:type="spellStart"/>
       <w:r>
@@ -1618,23 +1455,7 @@
           <w:sz w:val="18"/>
           <w:szCs w:val="18"/>
         </w:rPr>
-        <w:t>-green to idle non-production workloads off-hours and moving eligible</w:t>
-      </w:r>
-      <w:r>
-        <w:rPr>
-          <w:rFonts w:ascii="Arial" w:hAnsi="Arial" w:cs="Arial"/>
-          <w:sz w:val="18"/>
-          <w:szCs w:val="18"/>
-        </w:rPr>
-        <w:t xml:space="preserve"> </w:t>
-      </w:r>
-      <w:r>
-        <w:rPr>
-          <w:rFonts w:ascii="Arial" w:hAnsi="Arial" w:cs="Arial"/>
-          <w:sz w:val="18"/>
-          <w:szCs w:val="18"/>
-        </w:rPr>
-        <w:t>dev and QA fleets onto spot instances.</w:t>
+        <w:t>-green to idle non-production workloads off-hours and moving eligible dev and QA fleets onto spot instances.</w:t>
       </w:r>
     </w:p>
     <w:p>
@@ -1657,23 +1478,7 @@
           <w:sz w:val="18"/>
           <w:szCs w:val="18"/>
         </w:rPr>
-        <w:t>Gave every team a bill for its own footprint, attributing storage and network spend to the owning project across three regions and two clouds</w:t>
-      </w:r>
-      <w:r>
-        <w:rPr>
-          <w:rFonts w:ascii="Arial" w:hAnsi="Arial" w:cs="Arial"/>
-          <w:sz w:val="18"/>
-          <w:szCs w:val="18"/>
-        </w:rPr>
-        <w:t xml:space="preserve"> </w:t>
-      </w:r>
-      <w:r>
-        <w:rPr>
-          <w:rFonts w:ascii="Arial" w:hAnsi="Arial" w:cs="Arial"/>
-          <w:sz w:val="18"/>
-          <w:szCs w:val="18"/>
-        </w:rPr>
-        <w:t>and classifying each transfer as same-AZ, cross-AZ or cross-region so teams could see - and cut - the cost of their own traffic.</w:t>
+        <w:t>Gave every team a bill for its own footprint, attributing storage and network spend to the owning project across three regions and two clouds and classifying each transfer as same-AZ, cross-AZ or cross-region so teams could see - and cut - the cost of their own traffic.</w:t>
       </w:r>
     </w:p>
     <w:p>
@@ -1714,39 +1519,7 @@
           <w:sz w:val="18"/>
           <w:szCs w:val="18"/>
         </w:rPr>
-        <w:t xml:space="preserve"> -</w:t>
-      </w:r>
-      <w:r>
-        <w:rPr>
-          <w:rFonts w:ascii="Arial" w:hAnsi="Arial" w:cs="Arial"/>
-          <w:sz w:val="18"/>
-          <w:szCs w:val="18"/>
-        </w:rPr>
-        <w:t xml:space="preserve"> </w:t>
-      </w:r>
-      <w:r>
-        <w:rPr>
-          <w:rFonts w:ascii="Arial" w:hAnsi="Arial" w:cs="Arial"/>
-          <w:sz w:val="18"/>
-          <w:szCs w:val="18"/>
-        </w:rPr>
-        <w:t>developer commit, GitLab build, runner, Artifactory publish, Xray scan, cluster, namespace - so any CVE traces to who published it, what built it,</w:t>
-      </w:r>
-      <w:r>
-        <w:rPr>
-          <w:rFonts w:ascii="Arial" w:hAnsi="Arial" w:cs="Arial"/>
-          <w:sz w:val="18"/>
-          <w:szCs w:val="18"/>
-        </w:rPr>
-        <w:t xml:space="preserve"> </w:t>
-      </w:r>
-      <w:r>
-        <w:rPr>
-          <w:rFonts w:ascii="Arial" w:hAnsi="Arial" w:cs="Arial"/>
-          <w:sz w:val="18"/>
-          <w:szCs w:val="18"/>
-        </w:rPr>
-        <w:t>and every place it runs.</w:t>
+        <w:t xml:space="preserve"> - developer commit, GitLab build, runner, Artifactory publish, Xray scan, cluster, namespace - so any CVE traces to who published it, what built it, and every place it runs.</w:t>
       </w:r>
     </w:p>
     <w:p>
@@ -1787,23 +1560,7 @@
           <w:sz w:val="18"/>
           <w:szCs w:val="18"/>
         </w:rPr>
-        <w:t>, a Claude multi-agent system that triages incoming tickets, dispatches Kubernetes,</w:t>
-      </w:r>
-      <w:r>
-        <w:rPr>
-          <w:rFonts w:ascii="Arial" w:hAnsi="Arial" w:cs="Arial"/>
-          <w:sz w:val="18"/>
-          <w:szCs w:val="18"/>
-        </w:rPr>
-        <w:t xml:space="preserve"> </w:t>
-      </w:r>
-      <w:r>
-        <w:rPr>
-          <w:rFonts w:ascii="Arial" w:hAnsi="Arial" w:cs="Arial"/>
-          <w:sz w:val="18"/>
-          <w:szCs w:val="18"/>
-        </w:rPr>
-        <w:t>observability and code agents, and opens merge requests with proposed fixes for human review.</w:t>
+        <w:t>, a Claude multi-agent system that triages incoming tickets, dispatches Kubernetes, observability and code agents, and opens merge requests with proposed fixes for human review.</w:t>
       </w:r>
     </w:p>
     <w:p>
@@ -1844,39 +1601,7 @@
           <w:sz w:val="18"/>
           <w:szCs w:val="18"/>
         </w:rPr>
-        <w:t xml:space="preserve"> and scoped</w:t>
-      </w:r>
-      <w:r>
-        <w:rPr>
-          <w:rFonts w:ascii="Arial" w:hAnsi="Arial" w:cs="Arial"/>
-          <w:sz w:val="18"/>
-          <w:szCs w:val="18"/>
-        </w:rPr>
-        <w:t xml:space="preserve"> </w:t>
-      </w:r>
-      <w:r>
-        <w:rPr>
-          <w:rFonts w:ascii="Arial" w:hAnsi="Arial" w:cs="Arial"/>
-          <w:sz w:val="18"/>
-          <w:szCs w:val="18"/>
-        </w:rPr>
-        <w:t>analyzer RBAC that route cluster failures through an internal LLM gateway and render plain-language diagnoses beside the owning application</w:t>
-      </w:r>
-      <w:r>
-        <w:rPr>
-          <w:rFonts w:ascii="Arial" w:hAnsi="Arial" w:cs="Arial"/>
-          <w:sz w:val="18"/>
-          <w:szCs w:val="18"/>
-        </w:rPr>
-        <w:t xml:space="preserve"> </w:t>
-      </w:r>
-      <w:r>
-        <w:rPr>
-          <w:rFonts w:ascii="Arial" w:hAnsi="Arial" w:cs="Arial"/>
-          <w:sz w:val="18"/>
-          <w:szCs w:val="18"/>
-        </w:rPr>
-        <w:t xml:space="preserve">in </w:t>
+        <w:t xml:space="preserve"> and scoped analyzer RBAC that route cluster failures through an internal LLM gateway and render plain-language diagnoses beside the owning application in </w:t>
       </w:r>
       <w:proofErr w:type="spellStart"/>
       <w:r>
@@ -1917,23 +1642,7 @@
           <w:sz w:val="18"/>
           <w:szCs w:val="18"/>
         </w:rPr>
-        <w:t>Eliminated configuration drift and cut provisioning time 80% by architecting Configuration as Code in Terraform and Python, managing</w:t>
-      </w:r>
-      <w:r>
-        <w:rPr>
-          <w:rFonts w:ascii="Arial" w:hAnsi="Arial" w:cs="Arial"/>
-          <w:sz w:val="18"/>
-          <w:szCs w:val="18"/>
-        </w:rPr>
-        <w:t xml:space="preserve"> </w:t>
-      </w:r>
-      <w:r>
-        <w:rPr>
-          <w:rFonts w:ascii="Arial" w:hAnsi="Arial" w:cs="Arial"/>
-          <w:sz w:val="18"/>
-          <w:szCs w:val="18"/>
-        </w:rPr>
-        <w:t>repositories, permissions, LDAP group mappings and retention policies declaratively across every environment.</w:t>
+        <w:t>Eliminated configuration drift and cut provisioning time 80% by architecting Configuration as Code in Terraform and Python, managing repositories, permissions, LDAP group mappings and retention policies declaratively across every environment.</w:t>
       </w:r>
     </w:p>
     <w:p>
@@ -2036,23 +1745,7 @@
           <w:sz w:val="18"/>
           <w:szCs w:val="18"/>
         </w:rPr>
-        <w:t>Enabled 100+ teams to self-provision CI/CD runners in under 5 minutes by building GitLab Runners as a Service across AWS and GCP</w:t>
-      </w:r>
-      <w:r>
-        <w:rPr>
-          <w:rFonts w:ascii="Arial" w:hAnsi="Arial" w:cs="Arial"/>
-          <w:sz w:val="18"/>
-          <w:szCs w:val="18"/>
-        </w:rPr>
-        <w:t xml:space="preserve"> </w:t>
-      </w:r>
-      <w:r>
-        <w:rPr>
-          <w:rFonts w:ascii="Arial" w:hAnsi="Arial" w:cs="Arial"/>
-          <w:sz w:val="18"/>
-          <w:szCs w:val="18"/>
-        </w:rPr>
-        <w:t>regions, with cost attribution and observability built in.</w:t>
+        <w:t>Enabled 100+ teams to self-provision CI/CD runners in under 5 minutes by building GitLab Runners as a Service across AWS and GCP regions, with cost attribution and observability built in.</w:t>
       </w:r>
     </w:p>
     <w:p>
@@ -2111,23 +1804,7 @@
           <w:sz w:val="18"/>
           <w:szCs w:val="18"/>
         </w:rPr>
-        <w:t>, sourcing</w:t>
-      </w:r>
-      <w:r>
-        <w:rPr>
-          <w:rFonts w:ascii="Arial" w:hAnsi="Arial" w:cs="Arial"/>
-          <w:sz w:val="18"/>
-          <w:szCs w:val="18"/>
-        </w:rPr>
-        <w:t xml:space="preserve"> </w:t>
-      </w:r>
-      <w:r>
-        <w:rPr>
-          <w:rFonts w:ascii="Arial" w:hAnsi="Arial" w:cs="Arial"/>
-          <w:sz w:val="18"/>
-          <w:szCs w:val="18"/>
-        </w:rPr>
-        <w:t xml:space="preserve">tokens at runtime from AWS Secrets Manager via External Secrets Operator so rotation became a secret update instead of a redeploy across </w:t>
+        <w:t xml:space="preserve">, sourcing tokens at runtime from AWS Secrets Manager via External Secrets Operator so rotation became a secret update instead of a redeploy across </w:t>
       </w:r>
       <w:r>
         <w:rPr>
@@ -2184,23 +1861,7 @@
           <w:sz w:val="18"/>
           <w:szCs w:val="18"/>
         </w:rPr>
-        <w:t xml:space="preserve"> Notifications and Terraform, routing</w:t>
-      </w:r>
-      <w:r>
-        <w:rPr>
-          <w:rFonts w:ascii="Arial" w:hAnsi="Arial" w:cs="Arial"/>
-          <w:sz w:val="18"/>
-          <w:szCs w:val="18"/>
-        </w:rPr>
-        <w:t xml:space="preserve"> </w:t>
-      </w:r>
-      <w:r>
-        <w:rPr>
-          <w:rFonts w:ascii="Arial" w:hAnsi="Arial" w:cs="Arial"/>
-          <w:sz w:val="18"/>
-          <w:szCs w:val="18"/>
-        </w:rPr>
-        <w:t>PagerDuty, Slack and email with team-based RBAC.</w:t>
+        <w:t xml:space="preserve"> Notifications and Terraform, routing PagerDuty, Slack and email with team-based RBAC.</w:t>
       </w:r>
     </w:p>
     <w:p>
@@ -2223,23 +1884,7 @@
           <w:sz w:val="18"/>
           <w:szCs w:val="18"/>
         </w:rPr>
-        <w:t>Ended stale-rotation pages for 20+ engineering teams by building a PagerDuty-to-Slack sync service that keeps each team's Slack handle</w:t>
-      </w:r>
-      <w:r>
-        <w:rPr>
-          <w:rFonts w:ascii="Arial" w:hAnsi="Arial" w:cs="Arial"/>
-          <w:sz w:val="18"/>
-          <w:szCs w:val="18"/>
-        </w:rPr>
-        <w:t xml:space="preserve"> </w:t>
-      </w:r>
-      <w:r>
-        <w:rPr>
-          <w:rFonts w:ascii="Arial" w:hAnsi="Arial" w:cs="Arial"/>
-          <w:sz w:val="18"/>
-          <w:szCs w:val="18"/>
-        </w:rPr>
-        <w:t xml:space="preserve">resolved to whoever is </w:t>
+        <w:t xml:space="preserve">Ended stale-rotation pages for 20+ engineering teams by building a PagerDuty-to-Slack sync service that keeps each team's Slack handle resolved to whoever is </w:t>
       </w:r>
       <w:proofErr w:type="gramStart"/>
       <w:r>
@@ -2298,23 +1943,7 @@
           <w:sz w:val="18"/>
           <w:szCs w:val="18"/>
         </w:rPr>
-        <w:t>, a distributed tracing tool that follows a CI job across the service mesh, ingress and</w:t>
-      </w:r>
-      <w:r>
-        <w:rPr>
-          <w:rFonts w:ascii="Arial" w:hAnsi="Arial" w:cs="Arial"/>
-          <w:sz w:val="18"/>
-          <w:szCs w:val="18"/>
-        </w:rPr>
-        <w:t xml:space="preserve"> </w:t>
-      </w:r>
-      <w:r>
-        <w:rPr>
-          <w:rFonts w:ascii="Arial" w:hAnsi="Arial" w:cs="Arial"/>
-          <w:sz w:val="18"/>
-          <w:szCs w:val="18"/>
-        </w:rPr>
-        <w:t>artifact backends.</w:t>
+        <w:t>, a distributed tracing tool that follows a CI job across the service mesh, ingress and artifact backends.</w:t>
       </w:r>
     </w:p>
     <w:p>
@@ -2356,23 +1985,7 @@
           <w:sz w:val="18"/>
           <w:szCs w:val="18"/>
         </w:rPr>
-        <w:t>, React, PostgreSQL) that discovers every</w:t>
-      </w:r>
-      <w:r>
-        <w:rPr>
-          <w:rFonts w:ascii="Arial" w:hAnsi="Arial" w:cs="Arial"/>
-          <w:sz w:val="18"/>
-          <w:szCs w:val="18"/>
-        </w:rPr>
-        <w:t xml:space="preserve"> </w:t>
-      </w:r>
-      <w:r>
-        <w:rPr>
-          <w:rFonts w:ascii="Arial" w:hAnsi="Arial" w:cs="Arial"/>
-          <w:sz w:val="18"/>
-          <w:szCs w:val="18"/>
-        </w:rPr>
-        <w:t>personal, group and project access token, alerts owners ahead of expiry, and surfaces stale credentials for revocation.</w:t>
+        <w:t>, React, PostgreSQL) that discovers every personal, group and project access token, alerts owners ahead of expiry, and surfaces stale credentials for revocation.</w:t>
       </w:r>
     </w:p>
     <w:p>
@@ -2483,23 +2096,7 @@
           <w:sz w:val="18"/>
           <w:szCs w:val="18"/>
         </w:rPr>
-        <w:t>Scaled identity verification to 250M+ API requests/day with an event-driven pipeline on AWS Lambda, S3, SQS and EMR for real-time</w:t>
-      </w:r>
-      <w:r>
-        <w:rPr>
-          <w:rFonts w:ascii="Arial" w:hAnsi="Arial" w:cs="Arial"/>
-          <w:sz w:val="18"/>
-          <w:szCs w:val="18"/>
-        </w:rPr>
-        <w:t xml:space="preserve"> </w:t>
-      </w:r>
-      <w:r>
-        <w:rPr>
-          <w:rFonts w:ascii="Arial" w:hAnsi="Arial" w:cs="Arial"/>
-          <w:sz w:val="18"/>
-          <w:szCs w:val="18"/>
-        </w:rPr>
-        <w:t>background checks and fraud detection.</w:t>
+        <w:t>Scaled identity verification to 250M+ API requests/day with an event-driven pipeline on AWS Lambda, S3, SQS and EMR for real-time background checks and fraud detection.</w:t>
       </w:r>
     </w:p>
     <w:p>
@@ -2522,23 +2119,7 @@
           <w:sz w:val="18"/>
           <w:szCs w:val="18"/>
         </w:rPr>
-        <w:t>Expanded coverage to 150+ government data sources used by 50+ enterprise financial clients by building REST APIs for identity verification</w:t>
-      </w:r>
-      <w:r>
-        <w:rPr>
-          <w:rFonts w:ascii="Arial" w:hAnsi="Arial" w:cs="Arial"/>
-          <w:sz w:val="18"/>
-          <w:szCs w:val="18"/>
-        </w:rPr>
-        <w:t xml:space="preserve"> </w:t>
-      </w:r>
-      <w:r>
-        <w:rPr>
-          <w:rFonts w:ascii="Arial" w:hAnsi="Arial" w:cs="Arial"/>
-          <w:sz w:val="18"/>
-          <w:szCs w:val="18"/>
-        </w:rPr>
-        <w:t>and KYC compliance.</w:t>
+        <w:t>Expanded coverage to 150+ government data sources used by 50+ enterprise financial clients by building REST APIs for identity verification and KYC compliance.</w:t>
       </w:r>
     </w:p>
     <w:p>
@@ -2765,23 +2346,7 @@
           <w:sz w:val="18"/>
           <w:szCs w:val="18"/>
         </w:rPr>
-        <w:t>before production impact by building an automated chaos engineering framework using Gremlin for scheduled</w:t>
-      </w:r>
-      <w:r>
-        <w:rPr>
-          <w:rFonts w:ascii="Arial" w:hAnsi="Arial" w:cs="Arial"/>
-          <w:sz w:val="18"/>
-          <w:szCs w:val="18"/>
-        </w:rPr>
-        <w:t xml:space="preserve"> </w:t>
-      </w:r>
-      <w:r>
-        <w:rPr>
-          <w:rFonts w:ascii="Arial" w:hAnsi="Arial" w:cs="Arial"/>
-          <w:sz w:val="18"/>
-          <w:szCs w:val="18"/>
-        </w:rPr>
-        <w:t>resilience and reliability testing of Kubernetes workloads.</w:t>
+        <w:t>before production impact by building an automated chaos engineering framework using Gremlin for scheduled resilience and reliability testing of Kubernetes workloads.</w:t>
       </w:r>
     </w:p>
     <w:p>
@@ -2921,23 +2486,7 @@
           <w:sz w:val="18"/>
           <w:szCs w:val="18"/>
         </w:rPr>
-        <w:t>Delivered the Angel Fund MVP to production 2 weeks ahead of the 3-month deadline by architecting and building the complete backend stack</w:t>
-      </w:r>
-      <w:r>
-        <w:rPr>
-          <w:rFonts w:ascii="Arial" w:hAnsi="Arial" w:cs="Arial"/>
-          <w:sz w:val="18"/>
-          <w:szCs w:val="18"/>
-        </w:rPr>
-        <w:t xml:space="preserve"> </w:t>
-      </w:r>
-      <w:r>
-        <w:rPr>
-          <w:rFonts w:ascii="Arial" w:hAnsi="Arial" w:cs="Arial"/>
-          <w:sz w:val="18"/>
-          <w:szCs w:val="18"/>
-        </w:rPr>
-        <w:t>from scratch to deployment.</w:t>
+        <w:t>Delivered the Angel Fund MVP to production 2 weeks ahead of the 3-month deadline by architecting and building the complete backend stack from scratch to deployment.</w:t>
       </w:r>
     </w:p>
     <w:p>
@@ -2960,23 +2509,7 @@
           <w:sz w:val="18"/>
           <w:szCs w:val="18"/>
         </w:rPr>
-        <w:t>Cut deployment time from 2+ hours to 15 minutes across 4 application stacks with fully automated CI/CD pipelines and real-time analytics</w:t>
-      </w:r>
-      <w:r>
-        <w:rPr>
-          <w:rFonts w:ascii="Arial" w:hAnsi="Arial" w:cs="Arial"/>
-          <w:sz w:val="18"/>
-          <w:szCs w:val="18"/>
-        </w:rPr>
-        <w:t xml:space="preserve"> </w:t>
-      </w:r>
-      <w:r>
-        <w:rPr>
-          <w:rFonts w:ascii="Arial" w:hAnsi="Arial" w:cs="Arial"/>
-          <w:sz w:val="18"/>
-          <w:szCs w:val="18"/>
-        </w:rPr>
-        <w:t>dashboards.</w:t>
+        <w:t>Cut deployment time from 2+ hours to 15 minutes across 4 application stacks with fully automated CI/CD pipelines and real-time analytics dashboards.</w:t>
       </w:r>
     </w:p>
     <w:p>
@@ -3133,43 +2666,7 @@
           <w:sz w:val="18"/>
           <w:szCs w:val="18"/>
         </w:rPr>
-        <w:t>Multi-agent system that triages incoming infrastructure tickets and monitors cluster health via Prometheus, dispatching specialized Kubernetes</w:t>
-      </w:r>
-      <w:r>
-        <w:rPr>
-          <w:rFonts w:ascii="Arial" w:hAnsi="Arial" w:cs="Arial"/>
-          <w:color w:val="343434"/>
-          <w:sz w:val="18"/>
-          <w:szCs w:val="18"/>
-        </w:rPr>
-        <w:t xml:space="preserve"> </w:t>
-      </w:r>
-      <w:r>
-        <w:rPr>
-          <w:rFonts w:ascii="Arial" w:hAnsi="Arial" w:cs="Arial"/>
-          <w:color w:val="343434"/>
-          <w:sz w:val="18"/>
-          <w:szCs w:val="18"/>
-        </w:rPr>
-        <w:t>diagnostics, observability and code-remediation agents. Detects pod crashes, resource exhaustion and failed deployments, then opens merge</w:t>
-      </w:r>
-      <w:r>
-        <w:rPr>
-          <w:rFonts w:ascii="Arial" w:hAnsi="Arial" w:cs="Arial"/>
-          <w:color w:val="343434"/>
-          <w:sz w:val="18"/>
-          <w:szCs w:val="18"/>
-        </w:rPr>
-        <w:t xml:space="preserve"> </w:t>
-      </w:r>
-      <w:r>
-        <w:rPr>
-          <w:rFonts w:ascii="Arial" w:hAnsi="Arial" w:cs="Arial"/>
-          <w:color w:val="343434"/>
-          <w:sz w:val="18"/>
-          <w:szCs w:val="18"/>
-        </w:rPr>
-        <w:t>requests with proposed fixes or executes remediation behind human-in-the-loop approval. Cut mean time to resolution 40%</w:t>
+        <w:t>Multi-agent system that triages incoming infrastructure tickets and monitors cluster health via Prometheus, dispatching specialized Kubernetes diagnostics, observability and code-remediation agents. Detects pod crashes, resource exhaustion and failed deployments, then opens merge requests with proposed fixes or executes remediation behind human-in-the-loop approval. Cut mean time to resolution 40%</w:t>
       </w:r>
       <w:r>
         <w:rPr>
@@ -3322,25 +2819,7 @@
           <w:sz w:val="18"/>
           <w:szCs w:val="18"/>
         </w:rPr>
-        <w:t xml:space="preserve"> - developer commit, GitLab build, runner, Artifactory publish, Xray scan, cluster and</w:t>
-      </w:r>
-      <w:r>
-        <w:rPr>
-          <w:rFonts w:ascii="Arial" w:hAnsi="Arial" w:cs="Arial"/>
-          <w:color w:val="343434"/>
-          <w:sz w:val="18"/>
-          <w:szCs w:val="18"/>
-        </w:rPr>
-        <w:t xml:space="preserve"> </w:t>
-      </w:r>
-      <w:r>
-        <w:rPr>
-          <w:rFonts w:ascii="Arial" w:hAnsi="Arial" w:cs="Arial"/>
-          <w:color w:val="343434"/>
-          <w:sz w:val="18"/>
-          <w:szCs w:val="18"/>
-        </w:rPr>
-        <w:t>namespace - so a CVE or vulnerable package can be traced to who published it, what built it, and every place it runs.</w:t>
+        <w:t xml:space="preserve"> - developer commit, GitLab build, runner, Artifactory publish, Xray scan, cluster and namespace - so a CVE or vulnerable package can be traced to who published it, what built it, and every place it runs.</w:t>
       </w:r>
       <w:bookmarkEnd w:id="5"/>
     </w:p>
@@ -3504,25 +2983,7 @@
           <w:sz w:val="18"/>
           <w:szCs w:val="18"/>
         </w:rPr>
-        <w:t xml:space="preserve"> jobs on Kubernetes, wit</w:t>
-      </w:r>
-      <w:r>
-        <w:rPr>
-          <w:rFonts w:ascii="Arial" w:hAnsi="Arial" w:cs="Arial"/>
-          <w:color w:val="343434"/>
-          <w:sz w:val="18"/>
-          <w:szCs w:val="18"/>
-        </w:rPr>
-        <w:t xml:space="preserve">h </w:t>
-      </w:r>
-      <w:r>
-        <w:rPr>
-          <w:rFonts w:ascii="Arial" w:hAnsi="Arial" w:cs="Arial"/>
-          <w:color w:val="343434"/>
-          <w:sz w:val="18"/>
-          <w:szCs w:val="18"/>
-        </w:rPr>
-        <w:t>JWT/OAuth authentication, resource validation and cost calculation.</w:t>
+        <w:t xml:space="preserve"> jobs on Kubernetes, with JWT/OAuth authentication, resource validation and cost calculation.</w:t>
       </w:r>
     </w:p>
     <w:p>
@@ -3842,23 +3303,7 @@
           <w:sz w:val="18"/>
           <w:szCs w:val="18"/>
         </w:rPr>
-        <w:t>t platform migration program in a single</w:t>
-      </w:r>
-      <w:r>
-        <w:rPr>
-          <w:rFonts w:ascii="Arial" w:hAnsi="Arial" w:cs="Arial"/>
-          <w:sz w:val="18"/>
-          <w:szCs w:val="18"/>
-        </w:rPr>
-        <w:t xml:space="preserve"> </w:t>
-      </w:r>
-      <w:r>
-        <w:rPr>
-          <w:rFonts w:ascii="Arial" w:hAnsi="Arial" w:cs="Arial"/>
-          <w:sz w:val="18"/>
-          <w:szCs w:val="18"/>
-        </w:rPr>
-        <w:t>quarter</w:t>
+        <w:t>t platform migration program in a single quarter</w:t>
       </w:r>
       <w:r>
         <w:rPr>
@@ -4069,15 +3514,7 @@
           <w:sz w:val="18"/>
           <w:szCs w:val="18"/>
         </w:rPr>
-        <w:t xml:space="preserve"> Computer Engineering</w:t>
-      </w:r>
-      <w:r>
-        <w:rPr>
-          <w:rFonts w:ascii="Arial" w:hAnsi="Arial" w:cs="Arial"/>
-          <w:sz w:val="18"/>
-          <w:szCs w:val="18"/>
-        </w:rPr>
-        <w:t xml:space="preserve">  </w:t>
+        <w:t xml:space="preserve"> Computer Engineering  </w:t>
       </w:r>
       <w:r>
         <w:rPr>

</xml_diff>

<commit_message>
content: correct ClickHouse capitalization in résumé skills
Co-Authored-By: Claude Opus 5 (1M context) <noreply@anthropic.com>
</commit_message>
<xml_diff>
--- a/Resume.docx
+++ b/Resume.docx
@@ -423,73 +423,15 @@
           <w:sz w:val="18"/>
           <w:szCs w:val="18"/>
         </w:rPr>
-        <w:t xml:space="preserve">CI/CD &amp; </w:t>
-      </w:r>
-      <w:proofErr w:type="spellStart"/>
-      <w:r>
-        <w:rPr>
-          <w:rFonts w:ascii="Arial" w:eastAsia="Arial" w:hAnsi="Arial" w:cs="Arial"/>
-          <w:b/>
-          <w:bCs/>
-          <w:sz w:val="18"/>
-          <w:szCs w:val="18"/>
-        </w:rPr>
-        <w:t>GitOps</w:t>
-      </w:r>
-      <w:proofErr w:type="spellEnd"/>
-      <w:r>
-        <w:rPr>
-          <w:rFonts w:ascii="Arial" w:eastAsia="Arial" w:hAnsi="Arial" w:cs="Arial"/>
-          <w:b/>
-          <w:bCs/>
-          <w:sz w:val="18"/>
-          <w:szCs w:val="18"/>
-        </w:rPr>
-        <w:t xml:space="preserve">: </w:t>
-      </w:r>
-      <w:r>
-        <w:rPr>
-          <w:rFonts w:ascii="Arial" w:eastAsia="Arial" w:hAnsi="Arial" w:cs="Arial"/>
-          <w:sz w:val="18"/>
-          <w:szCs w:val="18"/>
-        </w:rPr>
-        <w:t xml:space="preserve">GitLab CI/CD, GitHub Actions, Jenkins, </w:t>
-      </w:r>
-      <w:proofErr w:type="spellStart"/>
-      <w:r>
-        <w:rPr>
-          <w:rFonts w:ascii="Arial" w:eastAsia="Arial" w:hAnsi="Arial" w:cs="Arial"/>
-          <w:sz w:val="18"/>
-          <w:szCs w:val="18"/>
-        </w:rPr>
-        <w:t>ArgoCD</w:t>
-      </w:r>
-      <w:proofErr w:type="spellEnd"/>
-      <w:r>
-        <w:rPr>
-          <w:rFonts w:ascii="Arial" w:eastAsia="Arial" w:hAnsi="Arial" w:cs="Arial"/>
-          <w:sz w:val="18"/>
-          <w:szCs w:val="18"/>
-        </w:rPr>
-        <w:t xml:space="preserve">, </w:t>
-      </w:r>
-      <w:proofErr w:type="spellStart"/>
-      <w:r>
-        <w:rPr>
-          <w:rFonts w:ascii="Arial" w:eastAsia="Arial" w:hAnsi="Arial" w:cs="Arial"/>
-          <w:sz w:val="18"/>
-          <w:szCs w:val="18"/>
-        </w:rPr>
-        <w:t>FluxCD</w:t>
-      </w:r>
-      <w:proofErr w:type="spellEnd"/>
-      <w:r>
-        <w:rPr>
-          <w:rFonts w:ascii="Arial" w:eastAsia="Arial" w:hAnsi="Arial" w:cs="Arial"/>
-          <w:sz w:val="18"/>
-          <w:szCs w:val="18"/>
-        </w:rPr>
-        <w:t>, Spinnaker</w:t>
+        <w:t xml:space="preserve">CI/CD &amp; GitOps: </w:t>
+      </w:r>
+      <w:r>
+        <w:rPr>
+          <w:rFonts w:ascii="Arial" w:eastAsia="Arial" w:hAnsi="Arial" w:cs="Arial"/>
+          <w:sz w:val="18"/>
+          <w:szCs w:val="18"/>
+        </w:rPr>
+        <w:t>GitLab CI/CD, GitHub Actions, Jenkins, ArgoCD, FluxCD, Spinnaker</w:t>
       </w:r>
     </w:p>
     <w:p>
@@ -513,29 +455,7 @@
           <w:sz w:val="18"/>
           <w:szCs w:val="18"/>
         </w:rPr>
-        <w:t>Infrastructure as Code (</w:t>
-      </w:r>
-      <w:proofErr w:type="spellStart"/>
-      <w:r>
-        <w:rPr>
-          <w:rFonts w:ascii="Arial" w:eastAsia="Arial" w:hAnsi="Arial" w:cs="Arial"/>
-          <w:b/>
-          <w:bCs/>
-          <w:sz w:val="18"/>
-          <w:szCs w:val="18"/>
-        </w:rPr>
-        <w:t>IaC</w:t>
-      </w:r>
-      <w:proofErr w:type="spellEnd"/>
-      <w:r>
-        <w:rPr>
-          <w:rFonts w:ascii="Arial" w:eastAsia="Arial" w:hAnsi="Arial" w:cs="Arial"/>
-          <w:b/>
-          <w:bCs/>
-          <w:sz w:val="18"/>
-          <w:szCs w:val="18"/>
-        </w:rPr>
-        <w:t xml:space="preserve">): </w:t>
+        <w:t xml:space="preserve">Infrastructure as Code (IaC): </w:t>
       </w:r>
       <w:r>
         <w:rPr>
@@ -545,23 +465,13 @@
         </w:rPr>
         <w:t xml:space="preserve">Terraform, </w:t>
       </w:r>
-      <w:proofErr w:type="spellStart"/>
-      <w:r>
-        <w:rPr>
-          <w:rFonts w:ascii="Arial" w:eastAsia="Arial" w:hAnsi="Arial" w:cs="Arial"/>
-          <w:sz w:val="18"/>
-          <w:szCs w:val="18"/>
-        </w:rPr>
-        <w:t>Terragrunt</w:t>
-      </w:r>
-      <w:proofErr w:type="spellEnd"/>
-      <w:r>
-        <w:rPr>
-          <w:rFonts w:ascii="Arial" w:eastAsia="Arial" w:hAnsi="Arial" w:cs="Arial"/>
-          <w:sz w:val="18"/>
-          <w:szCs w:val="18"/>
-        </w:rPr>
-        <w:t xml:space="preserve">, </w:t>
+      <w:r>
+        <w:rPr>
+          <w:rFonts w:ascii="Arial" w:eastAsia="Arial" w:hAnsi="Arial" w:cs="Arial"/>
+          <w:sz w:val="18"/>
+          <w:szCs w:val="18"/>
+        </w:rPr>
+        <w:t xml:space="preserve">Terragrunt, </w:t>
       </w:r>
       <w:r>
         <w:rPr>
@@ -601,43 +511,7 @@
           <w:sz w:val="18"/>
           <w:szCs w:val="18"/>
         </w:rPr>
-        <w:t xml:space="preserve"> </w:t>
-      </w:r>
-      <w:proofErr w:type="spellStart"/>
-      <w:r>
-        <w:rPr>
-          <w:rFonts w:ascii="Arial" w:eastAsia="Arial" w:hAnsi="Arial" w:cs="Arial"/>
-          <w:sz w:val="18"/>
-          <w:szCs w:val="18"/>
-        </w:rPr>
-        <w:t>FastAPI</w:t>
-      </w:r>
-      <w:proofErr w:type="spellEnd"/>
-      <w:r>
-        <w:rPr>
-          <w:rFonts w:ascii="Arial" w:eastAsia="Arial" w:hAnsi="Arial" w:cs="Arial"/>
-          <w:sz w:val="18"/>
-          <w:szCs w:val="18"/>
-        </w:rPr>
-        <w:t xml:space="preserve">, Flask, Django, React, Next.js, </w:t>
-      </w:r>
-      <w:proofErr w:type="spellStart"/>
-      <w:r>
-        <w:rPr>
-          <w:rFonts w:ascii="Arial" w:eastAsia="Arial" w:hAnsi="Arial" w:cs="Arial"/>
-          <w:sz w:val="18"/>
-          <w:szCs w:val="18"/>
-        </w:rPr>
-        <w:t>Streamlit</w:t>
-      </w:r>
-      <w:proofErr w:type="spellEnd"/>
-      <w:r>
-        <w:rPr>
-          <w:rFonts w:ascii="Arial" w:eastAsia="Arial" w:hAnsi="Arial" w:cs="Arial"/>
-          <w:sz w:val="18"/>
-          <w:szCs w:val="18"/>
-        </w:rPr>
-        <w:t>, Celery, REST APIs</w:t>
+        <w:t xml:space="preserve"> FastAPI, Flask, Django, React, Next.js, Streamlit, Celery, REST APIs</w:t>
       </w:r>
     </w:p>
     <w:p>
@@ -669,18 +543,24 @@
           <w:sz w:val="18"/>
           <w:szCs w:val="18"/>
         </w:rPr>
-        <w:t xml:space="preserve">PostgreSQL, MongoDB, DynamoDB, MySQL, Redis, Neo4j, Amazon Redshift, </w:t>
-      </w:r>
-      <w:proofErr w:type="spellStart"/>
-      <w:r>
-        <w:rPr>
-          <w:rFonts w:ascii="Arial" w:eastAsia="Arial" w:hAnsi="Arial" w:cs="Arial"/>
-          <w:sz w:val="18"/>
-          <w:szCs w:val="18"/>
-        </w:rPr>
-        <w:t>Clickhouse</w:t>
-      </w:r>
-      <w:proofErr w:type="spellEnd"/>
+        <w:t>PostgreSQL, MongoDB, DynamoDB, MySQL, Redis, Neo4j, Amazon Redshift, Click</w:t>
+      </w:r>
+      <w:r>
+        <w:rPr>
+          <w:rFonts w:ascii="Arial" w:eastAsia="Arial" w:hAnsi="Arial" w:cs="Arial"/>
+          <w:sz w:val="18"/>
+          <w:szCs w:val="18"/>
+        </w:rPr>
+        <w:t>H</w:t>
+      </w:r>
+      <w:r>
+        <w:rPr>
+          <w:rFonts w:ascii="Arial" w:eastAsia="Arial" w:hAnsi="Arial" w:cs="Arial"/>
+          <w:sz w:val="18"/>
+          <w:szCs w:val="18"/>
+        </w:rPr>
+        <w:t>ouse</w:t>
+      </w:r>
     </w:p>
     <w:p>
       <w:pPr>
@@ -711,54 +591,8 @@
           <w:sz w:val="18"/>
           <w:szCs w:val="18"/>
         </w:rPr>
-        <w:t xml:space="preserve">Kubernetes, Docker, Helm, Istio Service Mesh, Cilium, </w:t>
-      </w:r>
-      <w:proofErr w:type="spellStart"/>
-      <w:r>
-        <w:rPr>
-          <w:rFonts w:ascii="Arial" w:eastAsia="Arial" w:hAnsi="Arial" w:cs="Arial"/>
-          <w:sz w:val="18"/>
-          <w:szCs w:val="18"/>
-        </w:rPr>
-        <w:t>ArgoCD</w:t>
-      </w:r>
-      <w:proofErr w:type="spellEnd"/>
-      <w:r>
-        <w:rPr>
-          <w:rFonts w:ascii="Arial" w:eastAsia="Arial" w:hAnsi="Arial" w:cs="Arial"/>
-          <w:sz w:val="18"/>
-          <w:szCs w:val="18"/>
-        </w:rPr>
-        <w:t xml:space="preserve">, </w:t>
-      </w:r>
-      <w:proofErr w:type="spellStart"/>
-      <w:r>
-        <w:rPr>
-          <w:rFonts w:ascii="Arial" w:eastAsia="Arial" w:hAnsi="Arial" w:cs="Arial"/>
-          <w:sz w:val="18"/>
-          <w:szCs w:val="18"/>
-        </w:rPr>
-        <w:t>Kustomize</w:t>
-      </w:r>
-      <w:proofErr w:type="spellEnd"/>
-      <w:r>
-        <w:rPr>
-          <w:rFonts w:ascii="Arial" w:eastAsia="Arial" w:hAnsi="Arial" w:cs="Arial"/>
-          <w:sz w:val="18"/>
-          <w:szCs w:val="18"/>
-        </w:rPr>
-        <w:t xml:space="preserve">, </w:t>
-      </w:r>
-      <w:proofErr w:type="spellStart"/>
-      <w:r>
-        <w:rPr>
-          <w:rFonts w:ascii="Arial" w:eastAsia="Arial" w:hAnsi="Arial" w:cs="Arial"/>
-          <w:sz w:val="18"/>
-          <w:szCs w:val="18"/>
-        </w:rPr>
-        <w:t>ApplicationSets</w:t>
-      </w:r>
-      <w:proofErr w:type="spellEnd"/>
+        <w:t>Kubernetes, Docker, Helm, Istio Service Mesh, Cilium, ArgoCD, Kustomize, ApplicationSets</w:t>
+      </w:r>
     </w:p>
     <w:p>
       <w:pPr>
@@ -854,36 +688,8 @@
           <w:sz w:val="18"/>
           <w:szCs w:val="18"/>
         </w:rPr>
-        <w:t xml:space="preserve">Prometheus, Thanos, Loki, Grafana, Mimir, Elasticsearch, </w:t>
-      </w:r>
-      <w:proofErr w:type="spellStart"/>
-      <w:r>
-        <w:rPr>
-          <w:rFonts w:ascii="Arial" w:eastAsia="Arial" w:hAnsi="Arial" w:cs="Arial"/>
-          <w:sz w:val="18"/>
-          <w:szCs w:val="18"/>
-        </w:rPr>
-        <w:t>OpenTelemetry</w:t>
-      </w:r>
-      <w:proofErr w:type="spellEnd"/>
-      <w:r>
-        <w:rPr>
-          <w:rFonts w:ascii="Arial" w:eastAsia="Arial" w:hAnsi="Arial" w:cs="Arial"/>
-          <w:sz w:val="18"/>
-          <w:szCs w:val="18"/>
-        </w:rPr>
-        <w:t xml:space="preserve">, Datadog, PagerDuty, </w:t>
-      </w:r>
-      <w:proofErr w:type="spellStart"/>
-      <w:r>
-        <w:rPr>
-          <w:rFonts w:ascii="Arial" w:eastAsia="Arial" w:hAnsi="Arial" w:cs="Arial"/>
-          <w:sz w:val="18"/>
-          <w:szCs w:val="18"/>
-        </w:rPr>
-        <w:t>OpenCost</w:t>
-      </w:r>
-      <w:proofErr w:type="spellEnd"/>
+        <w:t>Prometheus, Thanos, Loki, Grafana, Mimir, Elasticsearch, OpenTelemetry, Datadog, PagerDuty, OpenCost</w:t>
+      </w:r>
     </w:p>
     <w:p>
       <w:pPr>
@@ -909,41 +715,13 @@
         </w:rPr>
         <w:t xml:space="preserve">Security &amp; Compliance: </w:t>
       </w:r>
-      <w:proofErr w:type="spellStart"/>
-      <w:r>
-        <w:rPr>
-          <w:rFonts w:ascii="Arial" w:eastAsia="Arial" w:hAnsi="Arial" w:cs="Arial"/>
-          <w:sz w:val="18"/>
-          <w:szCs w:val="18"/>
-        </w:rPr>
-        <w:t>ModSecurity</w:t>
-      </w:r>
-      <w:proofErr w:type="spellEnd"/>
-      <w:r>
-        <w:rPr>
-          <w:rFonts w:ascii="Arial" w:eastAsia="Arial" w:hAnsi="Arial" w:cs="Arial"/>
-          <w:sz w:val="18"/>
-          <w:szCs w:val="18"/>
-        </w:rPr>
-        <w:t xml:space="preserve">/OWASP CRS, ESO, SOPS, </w:t>
-      </w:r>
-      <w:proofErr w:type="spellStart"/>
-      <w:r>
-        <w:rPr>
-          <w:rFonts w:ascii="Arial" w:eastAsia="Arial" w:hAnsi="Arial" w:cs="Arial"/>
-          <w:sz w:val="18"/>
-          <w:szCs w:val="18"/>
-        </w:rPr>
-        <w:t>Trivy</w:t>
-      </w:r>
-      <w:proofErr w:type="spellEnd"/>
-      <w:r>
-        <w:rPr>
-          <w:rFonts w:ascii="Arial" w:eastAsia="Arial" w:hAnsi="Arial" w:cs="Arial"/>
-          <w:sz w:val="18"/>
-          <w:szCs w:val="18"/>
-        </w:rPr>
-        <w:t xml:space="preserve">, </w:t>
+      <w:r>
+        <w:rPr>
+          <w:rFonts w:ascii="Arial" w:eastAsia="Arial" w:hAnsi="Arial" w:cs="Arial"/>
+          <w:sz w:val="18"/>
+          <w:szCs w:val="18"/>
+        </w:rPr>
+        <w:t xml:space="preserve">ModSecurity/OWASP CRS, ESO, SOPS, Trivy, </w:t>
       </w:r>
       <w:r>
         <w:rPr>
@@ -1032,25 +810,7 @@
           <w:sz w:val="18"/>
           <w:szCs w:val="18"/>
         </w:rPr>
-        <w:t xml:space="preserve">Claude &amp; OpenAI SDK, Multi-Agent Orchestration, MCP, </w:t>
-      </w:r>
-      <w:proofErr w:type="spellStart"/>
-      <w:r>
-        <w:rPr>
-          <w:rFonts w:ascii="Arial" w:eastAsia="Arial" w:hAnsi="Arial" w:cs="Arial"/>
-          <w:sz w:val="18"/>
-          <w:szCs w:val="18"/>
-        </w:rPr>
-        <w:t>LangChain</w:t>
-      </w:r>
-      <w:proofErr w:type="spellEnd"/>
-      <w:r>
-        <w:rPr>
-          <w:rFonts w:ascii="Arial" w:eastAsia="Arial" w:hAnsi="Arial" w:cs="Arial"/>
-          <w:sz w:val="18"/>
-          <w:szCs w:val="18"/>
-        </w:rPr>
-        <w:t xml:space="preserve">, </w:t>
+        <w:t xml:space="preserve">Claude &amp; OpenAI SDK, Multi-Agent Orchestration, MCP, LangChain, </w:t>
       </w:r>
       <w:r>
         <w:rPr>
@@ -1109,7 +869,6 @@
         </w:rPr>
         <w:t xml:space="preserve">Roku                                                                                                                                                                             </w:t>
       </w:r>
-      <w:proofErr w:type="gramStart"/>
       <w:r>
         <w:rPr>
           <w:rFonts w:ascii="Arial" w:eastAsia="Arial" w:hAnsi="Arial" w:cs="Arial"/>
@@ -1128,18 +887,7 @@
           <w:sz w:val="18"/>
           <w:szCs w:val="18"/>
         </w:rPr>
-        <w:t>Boston</w:t>
-      </w:r>
-      <w:proofErr w:type="gramEnd"/>
-      <w:r>
-        <w:rPr>
-          <w:rFonts w:ascii="Arial" w:eastAsia="Arial" w:hAnsi="Arial" w:cs="Arial"/>
-          <w:i/>
-          <w:iCs/>
-          <w:sz w:val="18"/>
-          <w:szCs w:val="18"/>
-        </w:rPr>
-        <w:t>, MA</w:t>
+        <w:t>Boston, MA</w:t>
       </w:r>
     </w:p>
     <w:p>
@@ -1169,29 +917,7 @@
           <w:sz w:val="18"/>
           <w:szCs w:val="18"/>
         </w:rPr>
-        <w:t xml:space="preserve"> | Kubernetes, AWS, </w:t>
-      </w:r>
-      <w:proofErr w:type="spellStart"/>
-      <w:r>
-        <w:rPr>
-          <w:rFonts w:ascii="Arial" w:eastAsia="Arial" w:hAnsi="Arial" w:cs="Arial"/>
-          <w:i/>
-          <w:iCs/>
-          <w:sz w:val="18"/>
-          <w:szCs w:val="18"/>
-        </w:rPr>
-        <w:t>ArgoCD</w:t>
-      </w:r>
-      <w:proofErr w:type="spellEnd"/>
-      <w:r>
-        <w:rPr>
-          <w:rFonts w:ascii="Arial" w:eastAsia="Arial" w:hAnsi="Arial" w:cs="Arial"/>
-          <w:i/>
-          <w:iCs/>
-          <w:sz w:val="18"/>
-          <w:szCs w:val="18"/>
-        </w:rPr>
-        <w:t xml:space="preserve">, AI Agents                                            </w:t>
+        <w:t xml:space="preserve"> | Kubernetes, AWS, ArgoCD, AI Agents                                            </w:t>
       </w:r>
       <w:r>
         <w:rPr>
@@ -1301,79 +1027,7 @@
           <w:sz w:val="18"/>
           <w:szCs w:val="18"/>
         </w:rPr>
-        <w:t xml:space="preserve">Replaced pipeline-driven deploys with </w:t>
-      </w:r>
-      <w:proofErr w:type="spellStart"/>
-      <w:r>
-        <w:rPr>
-          <w:rFonts w:ascii="Arial" w:hAnsi="Arial" w:cs="Arial"/>
-          <w:sz w:val="18"/>
-          <w:szCs w:val="18"/>
-        </w:rPr>
-        <w:t>GitOps</w:t>
-      </w:r>
-      <w:proofErr w:type="spellEnd"/>
-      <w:r>
-        <w:rPr>
-          <w:rFonts w:ascii="Arial" w:hAnsi="Arial" w:cs="Arial"/>
-          <w:sz w:val="18"/>
-          <w:szCs w:val="18"/>
-        </w:rPr>
-        <w:t xml:space="preserve"> across the </w:t>
-      </w:r>
-      <w:proofErr w:type="gramStart"/>
-      <w:r>
-        <w:rPr>
-          <w:rFonts w:ascii="Arial" w:hAnsi="Arial" w:cs="Arial"/>
-          <w:sz w:val="18"/>
-          <w:szCs w:val="18"/>
-        </w:rPr>
-        <w:t>platform:</w:t>
-      </w:r>
-      <w:proofErr w:type="gramEnd"/>
-      <w:r>
-        <w:rPr>
-          <w:rFonts w:ascii="Arial" w:hAnsi="Arial" w:cs="Arial"/>
-          <w:sz w:val="18"/>
-          <w:szCs w:val="18"/>
-        </w:rPr>
-        <w:t xml:space="preserve"> stood up </w:t>
-      </w:r>
-      <w:proofErr w:type="spellStart"/>
-      <w:r>
-        <w:rPr>
-          <w:rFonts w:ascii="Arial" w:hAnsi="Arial" w:cs="Arial"/>
-          <w:sz w:val="18"/>
-          <w:szCs w:val="18"/>
-        </w:rPr>
-        <w:t>ArgoCD</w:t>
-      </w:r>
-      <w:proofErr w:type="spellEnd"/>
-      <w:r>
-        <w:rPr>
-          <w:rFonts w:ascii="Arial" w:hAnsi="Arial" w:cs="Arial"/>
-          <w:sz w:val="18"/>
-          <w:szCs w:val="18"/>
-        </w:rPr>
-        <w:t xml:space="preserve">, onboarded every owned service, and moved continuous delivery out of GitLab CI into declarative </w:t>
-      </w:r>
-      <w:proofErr w:type="spellStart"/>
-      <w:r>
-        <w:rPr>
-          <w:rFonts w:ascii="Arial" w:hAnsi="Arial" w:cs="Arial"/>
-          <w:sz w:val="18"/>
-          <w:szCs w:val="18"/>
-        </w:rPr>
-        <w:t>ApplicationSets</w:t>
-      </w:r>
-      <w:proofErr w:type="spellEnd"/>
-      <w:r>
-        <w:rPr>
-          <w:rFonts w:ascii="Arial" w:hAnsi="Arial" w:cs="Arial"/>
-          <w:sz w:val="18"/>
-          <w:szCs w:val="18"/>
-        </w:rPr>
-        <w:t xml:space="preserve"> - cutting release lead time, making rollback a git revert, and surfacing configuration drift in real time rather than at the next incident.</w:t>
+        <w:t>Replaced pipeline-driven deploys with GitOps across the platform: stood up ArgoCD, onboarded every owned service, and moved continuous delivery out of GitLab CI into declarative ApplicationSets - cutting release lead time, making rollback a git revert, and surfacing configuration drift in real time rather than at the next incident.</w:t>
       </w:r>
     </w:p>
     <w:p>
@@ -1419,43 +1073,7 @@
           <w:sz w:val="18"/>
           <w:szCs w:val="18"/>
         </w:rPr>
-        <w:t xml:space="preserve">Surfaced $200K+ in annual cloud savings by building a per-workload cost platform on </w:t>
-      </w:r>
-      <w:proofErr w:type="spellStart"/>
-      <w:r>
-        <w:rPr>
-          <w:rFonts w:ascii="Arial" w:hAnsi="Arial" w:cs="Arial"/>
-          <w:sz w:val="18"/>
-          <w:szCs w:val="18"/>
-        </w:rPr>
-        <w:t>OpenCost</w:t>
-      </w:r>
-      <w:proofErr w:type="spellEnd"/>
-      <w:r>
-        <w:rPr>
-          <w:rFonts w:ascii="Arial" w:hAnsi="Arial" w:cs="Arial"/>
-          <w:sz w:val="18"/>
-          <w:szCs w:val="18"/>
-        </w:rPr>
-        <w:t xml:space="preserve"> with AWS Cost and Usage Reports and spot pricing feeds through Glue and Athena, then acting on it - integrating </w:t>
-      </w:r>
-      <w:proofErr w:type="spellStart"/>
-      <w:r>
-        <w:rPr>
-          <w:rFonts w:ascii="Arial" w:hAnsi="Arial" w:cs="Arial"/>
-          <w:sz w:val="18"/>
-          <w:szCs w:val="18"/>
-        </w:rPr>
-        <w:t>kube</w:t>
-      </w:r>
-      <w:proofErr w:type="spellEnd"/>
-      <w:r>
-        <w:rPr>
-          <w:rFonts w:ascii="Arial" w:hAnsi="Arial" w:cs="Arial"/>
-          <w:sz w:val="18"/>
-          <w:szCs w:val="18"/>
-        </w:rPr>
-        <w:t>-green to idle non-production workloads off-hours and moving eligible dev and QA fleets onto spot instances.</w:t>
+        <w:t>Surfaced $200K+ in annual cloud savings by building a per-workload cost platform on OpenCost with AWS Cost and Usage Reports and spot pricing feeds through Glue and Athena, then acting on it - integrating kube-green to idle non-production workloads off-hours and moving eligible dev and QA fleets onto spot instances.</w:t>
       </w:r>
     </w:p>
     <w:p>
@@ -1501,25 +1119,7 @@
           <w:sz w:val="18"/>
           <w:szCs w:val="18"/>
         </w:rPr>
-        <w:t xml:space="preserve">Turned vulnerability response from a multi-team investigation into a single query by modelling the full supply chain in Neo4j and </w:t>
-      </w:r>
-      <w:proofErr w:type="spellStart"/>
-      <w:r>
-        <w:rPr>
-          <w:rFonts w:ascii="Arial" w:hAnsi="Arial" w:cs="Arial"/>
-          <w:sz w:val="18"/>
-          <w:szCs w:val="18"/>
-        </w:rPr>
-        <w:t>ClickHouse</w:t>
-      </w:r>
-      <w:proofErr w:type="spellEnd"/>
-      <w:r>
-        <w:rPr>
-          <w:rFonts w:ascii="Arial" w:hAnsi="Arial" w:cs="Arial"/>
-          <w:sz w:val="18"/>
-          <w:szCs w:val="18"/>
-        </w:rPr>
-        <w:t xml:space="preserve"> - developer commit, GitLab build, runner, Artifactory publish, Xray scan, cluster, namespace - so any CVE traces to who published it, what built it, and every place it runs.</w:t>
+        <w:t>Turned vulnerability response from a multi-team investigation into a single query by modelling the full supply chain in Neo4j and ClickHouse - developer commit, GitLab build, runner, Artifactory publish, Xray scan, cluster, namespace - so any CVE traces to who published it, what built it, and every place it runs.</w:t>
       </w:r>
     </w:p>
     <w:p>
@@ -1542,25 +1142,7 @@
           <w:sz w:val="18"/>
           <w:szCs w:val="18"/>
         </w:rPr>
-        <w:t xml:space="preserve">Cut mean time to resolution 40% by building </w:t>
-      </w:r>
-      <w:proofErr w:type="spellStart"/>
-      <w:r>
-        <w:rPr>
-          <w:rFonts w:ascii="Arial" w:hAnsi="Arial" w:cs="Arial"/>
-          <w:sz w:val="18"/>
-          <w:szCs w:val="18"/>
-        </w:rPr>
-        <w:t>TicketOps</w:t>
-      </w:r>
-      <w:proofErr w:type="spellEnd"/>
-      <w:r>
-        <w:rPr>
-          <w:rFonts w:ascii="Arial" w:hAnsi="Arial" w:cs="Arial"/>
-          <w:sz w:val="18"/>
-          <w:szCs w:val="18"/>
-        </w:rPr>
-        <w:t>, a Claude multi-agent system that triages incoming tickets, dispatches Kubernetes, observability and code agents, and opens merge requests with proposed fixes for human review.</w:t>
+        <w:t>Cut mean time to resolution 40% by building TicketOps, a Claude multi-agent system that triages incoming tickets, dispatches Kubernetes, observability and code agents, and opens merge requests with proposed fixes for human review.</w:t>
       </w:r>
     </w:p>
     <w:p>
@@ -1583,43 +1165,7 @@
           <w:sz w:val="18"/>
           <w:szCs w:val="18"/>
         </w:rPr>
-        <w:t xml:space="preserve">Put root-cause analysis in front of engineers where they already work, building the findings API, per-environment </w:t>
-      </w:r>
-      <w:proofErr w:type="spellStart"/>
-      <w:r>
-        <w:rPr>
-          <w:rFonts w:ascii="Arial" w:hAnsi="Arial" w:cs="Arial"/>
-          <w:sz w:val="18"/>
-          <w:szCs w:val="18"/>
-        </w:rPr>
-        <w:t>ApplicationSets</w:t>
-      </w:r>
-      <w:proofErr w:type="spellEnd"/>
-      <w:r>
-        <w:rPr>
-          <w:rFonts w:ascii="Arial" w:hAnsi="Arial" w:cs="Arial"/>
-          <w:sz w:val="18"/>
-          <w:szCs w:val="18"/>
-        </w:rPr>
-        <w:t xml:space="preserve"> and scoped analyzer RBAC that route cluster failures through an internal LLM gateway and render plain-language diagnoses beside the owning application in </w:t>
-      </w:r>
-      <w:proofErr w:type="spellStart"/>
-      <w:r>
-        <w:rPr>
-          <w:rFonts w:ascii="Arial" w:hAnsi="Arial" w:cs="Arial"/>
-          <w:sz w:val="18"/>
-          <w:szCs w:val="18"/>
-        </w:rPr>
-        <w:t>ArgoCD</w:t>
-      </w:r>
-      <w:proofErr w:type="spellEnd"/>
-      <w:r>
-        <w:rPr>
-          <w:rFonts w:ascii="Arial" w:hAnsi="Arial" w:cs="Arial"/>
-          <w:sz w:val="18"/>
-          <w:szCs w:val="18"/>
-        </w:rPr>
-        <w:t>.</w:t>
+        <w:t>Put root-cause analysis in front of engineers where they already work, building the findings API, per-environment ApplicationSets and scoped analyzer RBAC that route cluster failures through an internal LLM gateway and render plain-language diagnoses beside the owning application in ArgoCD.</w:t>
       </w:r>
     </w:p>
     <w:p>
@@ -1768,43 +1314,7 @@
           <w:sz w:val="18"/>
           <w:szCs w:val="18"/>
         </w:rPr>
-        <w:t xml:space="preserve">Removed long-lived runner credentials from infrastructure code by migrating CI runner fleets from Terraform to </w:t>
-      </w:r>
-      <w:proofErr w:type="spellStart"/>
-      <w:r>
-        <w:rPr>
-          <w:rFonts w:ascii="Arial" w:hAnsi="Arial" w:cs="Arial"/>
-          <w:sz w:val="18"/>
-          <w:szCs w:val="18"/>
-        </w:rPr>
-        <w:t>ArgoCD</w:t>
-      </w:r>
-      <w:proofErr w:type="spellEnd"/>
-      <w:r>
-        <w:rPr>
-          <w:rFonts w:ascii="Arial" w:hAnsi="Arial" w:cs="Arial"/>
-          <w:sz w:val="18"/>
-          <w:szCs w:val="18"/>
-        </w:rPr>
-        <w:t xml:space="preserve"> </w:t>
-      </w:r>
-      <w:proofErr w:type="spellStart"/>
-      <w:r>
-        <w:rPr>
-          <w:rFonts w:ascii="Arial" w:hAnsi="Arial" w:cs="Arial"/>
-          <w:sz w:val="18"/>
-          <w:szCs w:val="18"/>
-        </w:rPr>
-        <w:t>GitOps</w:t>
-      </w:r>
-      <w:proofErr w:type="spellEnd"/>
-      <w:r>
-        <w:rPr>
-          <w:rFonts w:ascii="Arial" w:hAnsi="Arial" w:cs="Arial"/>
-          <w:sz w:val="18"/>
-          <w:szCs w:val="18"/>
-        </w:rPr>
-        <w:t xml:space="preserve">, sourcing tokens at runtime from AWS Secrets Manager via External Secrets Operator so rotation became a secret update instead of a redeploy across </w:t>
+        <w:t xml:space="preserve">Removed long-lived runner credentials from infrastructure code by migrating CI runner fleets from Terraform to ArgoCD GitOps, sourcing tokens at runtime from AWS Secrets Manager via External Secrets Operator so rotation became a secret update instead of a redeploy across </w:t>
       </w:r>
       <w:r>
         <w:rPr>
@@ -1843,25 +1353,7 @@
           <w:sz w:val="18"/>
           <w:szCs w:val="18"/>
         </w:rPr>
-        <w:t xml:space="preserve">Reduced alert noise 60% and incident response time 35% with an alerting-as-code framework on </w:t>
-      </w:r>
-      <w:proofErr w:type="spellStart"/>
-      <w:r>
-        <w:rPr>
-          <w:rFonts w:ascii="Arial" w:hAnsi="Arial" w:cs="Arial"/>
-          <w:sz w:val="18"/>
-          <w:szCs w:val="18"/>
-        </w:rPr>
-        <w:t>ArgoCD</w:t>
-      </w:r>
-      <w:proofErr w:type="spellEnd"/>
-      <w:r>
-        <w:rPr>
-          <w:rFonts w:ascii="Arial" w:hAnsi="Arial" w:cs="Arial"/>
-          <w:sz w:val="18"/>
-          <w:szCs w:val="18"/>
-        </w:rPr>
-        <w:t xml:space="preserve"> Notifications and Terraform, routing PagerDuty, Slack and email with team-based RBAC.</w:t>
+        <w:t>Reduced alert noise 60% and incident response time 35% with an alerting-as-code framework on ArgoCD Notifications and Terraform, routing PagerDuty, Slack and email with team-based RBAC.</w:t>
       </w:r>
     </w:p>
     <w:p>
@@ -1884,25 +1376,7 @@
           <w:sz w:val="18"/>
           <w:szCs w:val="18"/>
         </w:rPr>
-        <w:t xml:space="preserve">Ended stale-rotation pages for 20+ engineering teams by building a PagerDuty-to-Slack sync service that keeps each team's Slack handle resolved to whoever is </w:t>
-      </w:r>
-      <w:proofErr w:type="gramStart"/>
-      <w:r>
-        <w:rPr>
-          <w:rFonts w:ascii="Arial" w:hAnsi="Arial" w:cs="Arial"/>
-          <w:sz w:val="18"/>
-          <w:szCs w:val="18"/>
-        </w:rPr>
-        <w:t>actually on</w:t>
-      </w:r>
-      <w:proofErr w:type="gramEnd"/>
-      <w:r>
-        <w:rPr>
-          <w:rFonts w:ascii="Arial" w:hAnsi="Arial" w:cs="Arial"/>
-          <w:sz w:val="18"/>
-          <w:szCs w:val="18"/>
-        </w:rPr>
-        <w:t xml:space="preserve"> call.</w:t>
+        <w:t>Ended stale-rotation pages for 20+ engineering teams by building a PagerDuty-to-Slack sync service that keeps each team's Slack handle resolved to whoever is actually on call.</w:t>
       </w:r>
     </w:p>
     <w:p>
@@ -1925,25 +1399,7 @@
           <w:sz w:val="18"/>
           <w:szCs w:val="18"/>
         </w:rPr>
-        <w:t xml:space="preserve">Cut CI/CD pipeline debugging time 50% with </w:t>
-      </w:r>
-      <w:proofErr w:type="spellStart"/>
-      <w:r>
-        <w:rPr>
-          <w:rFonts w:ascii="Arial" w:hAnsi="Arial" w:cs="Arial"/>
-          <w:sz w:val="18"/>
-          <w:szCs w:val="18"/>
-        </w:rPr>
-        <w:t>MeshTrace</w:t>
-      </w:r>
-      <w:proofErr w:type="spellEnd"/>
-      <w:r>
-        <w:rPr>
-          <w:rFonts w:ascii="Arial" w:hAnsi="Arial" w:cs="Arial"/>
-          <w:sz w:val="18"/>
-          <w:szCs w:val="18"/>
-        </w:rPr>
-        <w:t>, a distributed tracing tool that follows a CI job across the service mesh, ingress and artifact backends.</w:t>
+        <w:t>Cut CI/CD pipeline debugging time 50% with MeshTrace, a distributed tracing tool that follows a CI job across the service mesh, ingress and artifact backends.</w:t>
       </w:r>
     </w:p>
     <w:p>
@@ -1967,25 +1423,7 @@
           <w:szCs w:val="18"/>
         </w:rPr>
         <w:lastRenderedPageBreak/>
-        <w:t>Removed a recurring class of pipeline outages by building a token lifecycle platform (</w:t>
-      </w:r>
-      <w:proofErr w:type="spellStart"/>
-      <w:r>
-        <w:rPr>
-          <w:rFonts w:ascii="Arial" w:hAnsi="Arial" w:cs="Arial"/>
-          <w:sz w:val="18"/>
-          <w:szCs w:val="18"/>
-        </w:rPr>
-        <w:t>FastAPI</w:t>
-      </w:r>
-      <w:proofErr w:type="spellEnd"/>
-      <w:r>
-        <w:rPr>
-          <w:rFonts w:ascii="Arial" w:hAnsi="Arial" w:cs="Arial"/>
-          <w:sz w:val="18"/>
-          <w:szCs w:val="18"/>
-        </w:rPr>
-        <w:t>, React, PostgreSQL) that discovers every personal, group and project access token, alerts owners ahead of expiry, and surfaces stale credentials for revocation.</w:t>
+        <w:t>Removed a recurring class of pipeline outages by building a token lifecycle platform (FastAPI, React, PostgreSQL) that discovers every personal, group and project access token, alerts owners ahead of expiry, and surfaces stale credentials for revocation.</w:t>
       </w:r>
     </w:p>
     <w:p>
@@ -1995,7 +1433,6 @@
         </w:tabs>
         <w:spacing w:before="100"/>
       </w:pPr>
-      <w:proofErr w:type="spellStart"/>
       <w:r>
         <w:rPr>
           <w:rFonts w:ascii="Arial" w:eastAsia="Arial" w:hAnsi="Arial" w:cs="Arial"/>
@@ -2003,17 +1440,7 @@
           <w:bCs/>
           <w:color w:val="1E5CA8"/>
         </w:rPr>
-        <w:t>Perfios</w:t>
-      </w:r>
-      <w:proofErr w:type="spellEnd"/>
-      <w:r>
-        <w:rPr>
-          <w:rFonts w:ascii="Arial" w:eastAsia="Arial" w:hAnsi="Arial" w:cs="Arial"/>
-          <w:b/>
-          <w:bCs/>
-          <w:color w:val="1E5CA8"/>
-        </w:rPr>
-        <w:t xml:space="preserve">                                                                                                                                                                     </w:t>
+        <w:t xml:space="preserve">Perfios                                                                                                                                                                     </w:t>
       </w:r>
       <w:r>
         <w:rPr>
@@ -2267,33 +1694,7 @@
           <w:sz w:val="18"/>
           <w:szCs w:val="18"/>
         </w:rPr>
-        <w:t xml:space="preserve">INTERN - R&amp;D </w:t>
-      </w:r>
-      <w:proofErr w:type="spellStart"/>
-      <w:r>
-        <w:rPr>
-          <w:rFonts w:ascii="Arial" w:eastAsia="Arial" w:hAnsi="Arial" w:cs="Arial"/>
-          <w:b/>
-          <w:bCs/>
-          <w:i/>
-          <w:iCs/>
-          <w:sz w:val="18"/>
-          <w:szCs w:val="18"/>
-        </w:rPr>
-        <w:t>AllSight</w:t>
-      </w:r>
-      <w:proofErr w:type="spellEnd"/>
-      <w:r>
-        <w:rPr>
-          <w:rFonts w:ascii="Arial" w:eastAsia="Arial" w:hAnsi="Arial" w:cs="Arial"/>
-          <w:b/>
-          <w:bCs/>
-          <w:i/>
-          <w:iCs/>
-          <w:sz w:val="18"/>
-          <w:szCs w:val="18"/>
-        </w:rPr>
-        <w:t xml:space="preserve"> Team</w:t>
+        <w:t>INTERN - R&amp;D AllSight Team</w:t>
       </w:r>
       <w:r>
         <w:rPr>
@@ -2431,29 +1832,7 @@
           <w:sz w:val="18"/>
           <w:szCs w:val="18"/>
         </w:rPr>
-        <w:t xml:space="preserve"> | Python, </w:t>
-      </w:r>
-      <w:proofErr w:type="spellStart"/>
-      <w:r>
-        <w:rPr>
-          <w:rFonts w:ascii="Arial" w:eastAsia="Arial" w:hAnsi="Arial" w:cs="Arial"/>
-          <w:i/>
-          <w:iCs/>
-          <w:sz w:val="18"/>
-          <w:szCs w:val="18"/>
-        </w:rPr>
-        <w:t>Javascript</w:t>
-      </w:r>
-      <w:proofErr w:type="spellEnd"/>
-      <w:r>
-        <w:rPr>
-          <w:rFonts w:ascii="Arial" w:eastAsia="Arial" w:hAnsi="Arial" w:cs="Arial"/>
-          <w:i/>
-          <w:iCs/>
-          <w:sz w:val="18"/>
-          <w:szCs w:val="18"/>
-        </w:rPr>
-        <w:t xml:space="preserve">, Bash, Kafka, CI/CD                                   </w:t>
+        <w:t xml:space="preserve"> | Python, Javascript, Bash, Kafka, CI/CD                                   </w:t>
       </w:r>
       <w:r>
         <w:rPr>
@@ -2536,7 +1915,6 @@
         <w:spacing w:before="100"/>
       </w:pPr>
       <w:bookmarkStart w:id="3" w:name="OLE_LINK5"/>
-      <w:proofErr w:type="spellStart"/>
       <w:r>
         <w:rPr>
           <w:rFonts w:ascii="Arial" w:eastAsia="Arial" w:hAnsi="Arial" w:cs="Arial"/>
@@ -2546,7 +1924,6 @@
         </w:rPr>
         <w:t>TicketOps</w:t>
       </w:r>
-      <w:proofErr w:type="spellEnd"/>
       <w:r>
         <w:rPr>
           <w:rFonts w:ascii="Arial" w:eastAsia="Arial" w:hAnsi="Arial" w:cs="Arial"/>
@@ -2727,7 +2104,6 @@
         </w:rPr>
         <w:t xml:space="preserve">, </w:t>
       </w:r>
-      <w:proofErr w:type="spellStart"/>
       <w:r>
         <w:rPr>
           <w:rFonts w:ascii="Arial" w:eastAsia="Arial" w:hAnsi="Arial" w:cs="Arial"/>
@@ -2738,7 +2114,6 @@
         </w:rPr>
         <w:t>ClickHouse</w:t>
       </w:r>
-      <w:proofErr w:type="spellEnd"/>
       <w:r>
         <w:rPr>
           <w:rFonts w:ascii="Arial" w:eastAsia="Arial" w:hAnsi="Arial" w:cs="Arial"/>
@@ -2757,20 +2132,8 @@
           <w:sz w:val="18"/>
           <w:szCs w:val="18"/>
         </w:rPr>
-        <w:t xml:space="preserve"> Collectors, Gitlab, Artifactory, Xray, </w:t>
-      </w:r>
-      <w:proofErr w:type="spellStart"/>
-      <w:r>
-        <w:rPr>
-          <w:rFonts w:ascii="Arial" w:eastAsia="Arial" w:hAnsi="Arial" w:cs="Arial"/>
-          <w:i/>
-          <w:iCs/>
-          <w:sz w:val="18"/>
-          <w:szCs w:val="18"/>
-        </w:rPr>
-        <w:t>Trivy</w:t>
-      </w:r>
-      <w:proofErr w:type="spellEnd"/>
+        <w:t xml:space="preserve"> Collectors, Gitlab, Artifactory, Xray, Trivy</w:t>
+      </w:r>
       <w:r>
         <w:rPr>
           <w:rFonts w:ascii="Arial" w:eastAsia="Arial" w:hAnsi="Arial" w:cs="Arial"/>
@@ -2799,27 +2162,7 @@
           <w:sz w:val="18"/>
           <w:szCs w:val="18"/>
         </w:rPr>
-        <w:t xml:space="preserve">Models the full software supply chain in Neo4j and </w:t>
-      </w:r>
-      <w:proofErr w:type="spellStart"/>
-      <w:r>
-        <w:rPr>
-          <w:rFonts w:ascii="Arial" w:hAnsi="Arial" w:cs="Arial"/>
-          <w:color w:val="343434"/>
-          <w:sz w:val="18"/>
-          <w:szCs w:val="18"/>
-        </w:rPr>
-        <w:t>ClickHouse</w:t>
-      </w:r>
-      <w:proofErr w:type="spellEnd"/>
-      <w:r>
-        <w:rPr>
-          <w:rFonts w:ascii="Arial" w:hAnsi="Arial" w:cs="Arial"/>
-          <w:color w:val="343434"/>
-          <w:sz w:val="18"/>
-          <w:szCs w:val="18"/>
-        </w:rPr>
-        <w:t xml:space="preserve"> - developer commit, GitLab build, runner, Artifactory publish, Xray scan, cluster and namespace - so a CVE or vulnerable package can be traced to who published it, what built it, and every place it runs.</w:t>
+        <w:t>Models the full software supply chain in Neo4j and ClickHouse - developer commit, GitLab build, runner, Artifactory publish, Xray scan, cluster and namespace - so a CVE or vulnerable package can be traced to who published it, what built it, and every place it runs.</w:t>
       </w:r>
       <w:bookmarkEnd w:id="5"/>
     </w:p>
@@ -2831,7 +2174,6 @@
         </w:tabs>
         <w:spacing w:before="200"/>
       </w:pPr>
-      <w:proofErr w:type="spellStart"/>
       <w:r>
         <w:rPr>
           <w:rFonts w:ascii="Arial" w:eastAsia="Arial" w:hAnsi="Arial" w:cs="Arial"/>
@@ -2850,7 +2192,6 @@
         </w:rPr>
         <w:t>Deploy</w:t>
       </w:r>
-      <w:proofErr w:type="spellEnd"/>
       <w:r>
         <w:rPr>
           <w:rFonts w:ascii="Arial" w:eastAsia="Arial" w:hAnsi="Arial" w:cs="Arial"/>
@@ -2880,29 +2221,7 @@
           <w:sz w:val="18"/>
           <w:szCs w:val="18"/>
         </w:rPr>
-        <w:t xml:space="preserve"> </w:t>
-      </w:r>
-      <w:proofErr w:type="spellStart"/>
-      <w:r>
-        <w:rPr>
-          <w:rFonts w:ascii="Arial" w:eastAsia="Arial" w:hAnsi="Arial" w:cs="Arial"/>
-          <w:i/>
-          <w:iCs/>
-          <w:sz w:val="18"/>
-          <w:szCs w:val="18"/>
-        </w:rPr>
-        <w:t>FastAPI</w:t>
-      </w:r>
-      <w:proofErr w:type="spellEnd"/>
-      <w:r>
-        <w:rPr>
-          <w:rFonts w:ascii="Arial" w:eastAsia="Arial" w:hAnsi="Arial" w:cs="Arial"/>
-          <w:i/>
-          <w:iCs/>
-          <w:sz w:val="18"/>
-          <w:szCs w:val="18"/>
-        </w:rPr>
-        <w:t xml:space="preserve">, React, </w:t>
+        <w:t xml:space="preserve"> FastAPI, React, </w:t>
       </w:r>
       <w:r>
         <w:rPr>
@@ -2963,27 +2282,7 @@
           <w:sz w:val="18"/>
           <w:szCs w:val="18"/>
         </w:rPr>
-        <w:t xml:space="preserve">Self-service deployment platform for one-click provisioning of databases, web servers, MCP servers, AI apps and </w:t>
-      </w:r>
-      <w:proofErr w:type="spellStart"/>
-      <w:r>
-        <w:rPr>
-          <w:rFonts w:ascii="Arial" w:hAnsi="Arial" w:cs="Arial"/>
-          <w:color w:val="343434"/>
-          <w:sz w:val="18"/>
-          <w:szCs w:val="18"/>
-        </w:rPr>
-        <w:t>cron</w:t>
-      </w:r>
-      <w:proofErr w:type="spellEnd"/>
-      <w:r>
-        <w:rPr>
-          <w:rFonts w:ascii="Arial" w:hAnsi="Arial" w:cs="Arial"/>
-          <w:color w:val="343434"/>
-          <w:sz w:val="18"/>
-          <w:szCs w:val="18"/>
-        </w:rPr>
-        <w:t xml:space="preserve"> jobs on Kubernetes, with JWT/OAuth authentication, resource validation and cost calculation.</w:t>
+        <w:t>Self-service deployment platform for one-click provisioning of databases, web servers, MCP servers, AI apps and cron jobs on Kubernetes, with JWT/OAuth authentication, resource validation and cost calculation.</w:t>
       </w:r>
     </w:p>
     <w:p>
@@ -3058,7 +2357,6 @@
         </w:rPr>
         <w:t xml:space="preserve">M.S. Computer Engineering | Specialization in Data Science | GPA: 3.5                                                                  </w:t>
       </w:r>
-      <w:proofErr w:type="gramStart"/>
       <w:r>
         <w:rPr>
           <w:rFonts w:ascii="Arial" w:eastAsia="Arial" w:hAnsi="Arial" w:cs="Arial"/>
@@ -3080,18 +2378,7 @@
           <w:sz w:val="18"/>
           <w:szCs w:val="18"/>
         </w:rPr>
-        <w:t>Aug</w:t>
-      </w:r>
-      <w:proofErr w:type="gramEnd"/>
-      <w:r>
-        <w:rPr>
-          <w:rFonts w:ascii="Arial" w:eastAsia="Arial" w:hAnsi="Arial" w:cs="Arial"/>
-          <w:i/>
-          <w:iCs/>
-          <w:sz w:val="18"/>
-          <w:szCs w:val="18"/>
-        </w:rPr>
-        <w:t xml:space="preserve"> 2019 - May 2021</w:t>
+        <w:t>Aug 2019 - May 2021</w:t>
       </w:r>
     </w:p>
     <w:p>
@@ -3110,7 +2397,6 @@
         </w:rPr>
         <w:t xml:space="preserve">Pune Vidyarthi Griha's, University of Pune                                                                                                               </w:t>
       </w:r>
-      <w:proofErr w:type="gramStart"/>
       <w:r>
         <w:rPr>
           <w:rFonts w:ascii="Arial" w:eastAsia="Arial" w:hAnsi="Arial" w:cs="Arial"/>
@@ -3129,18 +2415,7 @@
           <w:sz w:val="18"/>
           <w:szCs w:val="18"/>
         </w:rPr>
-        <w:t>Nashik</w:t>
-      </w:r>
-      <w:proofErr w:type="gramEnd"/>
-      <w:r>
-        <w:rPr>
-          <w:rFonts w:ascii="Arial" w:eastAsia="Arial" w:hAnsi="Arial" w:cs="Arial"/>
-          <w:i/>
-          <w:iCs/>
-          <w:sz w:val="18"/>
-          <w:szCs w:val="18"/>
-        </w:rPr>
-        <w:t>, IN</w:t>
+        <w:t>Nashik, IN</w:t>
       </w:r>
     </w:p>
     <w:p>
@@ -3215,7 +2490,6 @@
         </w:rPr>
         <w:t xml:space="preserve">  </w:t>
       </w:r>
-      <w:proofErr w:type="gramStart"/>
       <w:r>
         <w:rPr>
           <w:rFonts w:ascii="Arial" w:eastAsia="Arial" w:hAnsi="Arial" w:cs="Arial"/>
@@ -3237,18 +2511,7 @@
           <w:sz w:val="18"/>
           <w:szCs w:val="18"/>
         </w:rPr>
-        <w:t>May</w:t>
-      </w:r>
-      <w:proofErr w:type="gramEnd"/>
-      <w:r>
-        <w:rPr>
-          <w:rFonts w:ascii="Arial" w:eastAsia="Arial" w:hAnsi="Arial" w:cs="Arial"/>
-          <w:i/>
-          <w:iCs/>
-          <w:sz w:val="18"/>
-          <w:szCs w:val="18"/>
-        </w:rPr>
-        <w:t xml:space="preserve"> 2012 - May 2017</w:t>
+        <w:t>May 2012 - May 2017</w:t>
       </w:r>
     </w:p>
     <w:p>

</xml_diff>

<commit_message>
content: refresh résumé with patent link
Co-Authored-By: Claude Opus 5 (1M context) <noreply@anthropic.com>
</commit_message>
<xml_diff>
--- a/Resume.docx
+++ b/Resume.docx
@@ -423,15 +423,73 @@
           <w:sz w:val="18"/>
           <w:szCs w:val="18"/>
         </w:rPr>
-        <w:t xml:space="preserve">CI/CD &amp; GitOps: </w:t>
-      </w:r>
-      <w:r>
-        <w:rPr>
-          <w:rFonts w:ascii="Arial" w:eastAsia="Arial" w:hAnsi="Arial" w:cs="Arial"/>
-          <w:sz w:val="18"/>
-          <w:szCs w:val="18"/>
-        </w:rPr>
-        <w:t>GitLab CI/CD, GitHub Actions, Jenkins, ArgoCD, FluxCD, Spinnaker</w:t>
+        <w:t xml:space="preserve">CI/CD &amp; </w:t>
+      </w:r>
+      <w:proofErr w:type="spellStart"/>
+      <w:r>
+        <w:rPr>
+          <w:rFonts w:ascii="Arial" w:eastAsia="Arial" w:hAnsi="Arial" w:cs="Arial"/>
+          <w:b/>
+          <w:bCs/>
+          <w:sz w:val="18"/>
+          <w:szCs w:val="18"/>
+        </w:rPr>
+        <w:t>GitOps</w:t>
+      </w:r>
+      <w:proofErr w:type="spellEnd"/>
+      <w:r>
+        <w:rPr>
+          <w:rFonts w:ascii="Arial" w:eastAsia="Arial" w:hAnsi="Arial" w:cs="Arial"/>
+          <w:b/>
+          <w:bCs/>
+          <w:sz w:val="18"/>
+          <w:szCs w:val="18"/>
+        </w:rPr>
+        <w:t xml:space="preserve">: </w:t>
+      </w:r>
+      <w:r>
+        <w:rPr>
+          <w:rFonts w:ascii="Arial" w:eastAsia="Arial" w:hAnsi="Arial" w:cs="Arial"/>
+          <w:sz w:val="18"/>
+          <w:szCs w:val="18"/>
+        </w:rPr>
+        <w:t xml:space="preserve">GitLab CI/CD, GitHub Actions, Jenkins, </w:t>
+      </w:r>
+      <w:proofErr w:type="spellStart"/>
+      <w:r>
+        <w:rPr>
+          <w:rFonts w:ascii="Arial" w:eastAsia="Arial" w:hAnsi="Arial" w:cs="Arial"/>
+          <w:sz w:val="18"/>
+          <w:szCs w:val="18"/>
+        </w:rPr>
+        <w:t>ArgoCD</w:t>
+      </w:r>
+      <w:proofErr w:type="spellEnd"/>
+      <w:r>
+        <w:rPr>
+          <w:rFonts w:ascii="Arial" w:eastAsia="Arial" w:hAnsi="Arial" w:cs="Arial"/>
+          <w:sz w:val="18"/>
+          <w:szCs w:val="18"/>
+        </w:rPr>
+        <w:t xml:space="preserve">, </w:t>
+      </w:r>
+      <w:proofErr w:type="spellStart"/>
+      <w:r>
+        <w:rPr>
+          <w:rFonts w:ascii="Arial" w:eastAsia="Arial" w:hAnsi="Arial" w:cs="Arial"/>
+          <w:sz w:val="18"/>
+          <w:szCs w:val="18"/>
+        </w:rPr>
+        <w:t>FluxCD</w:t>
+      </w:r>
+      <w:proofErr w:type="spellEnd"/>
+      <w:r>
+        <w:rPr>
+          <w:rFonts w:ascii="Arial" w:eastAsia="Arial" w:hAnsi="Arial" w:cs="Arial"/>
+          <w:sz w:val="18"/>
+          <w:szCs w:val="18"/>
+        </w:rPr>
+        <w:t>, Spinnaker</w:t>
       </w:r>
     </w:p>
     <w:p>
@@ -455,7 +513,29 @@
           <w:sz w:val="18"/>
           <w:szCs w:val="18"/>
         </w:rPr>
-        <w:t xml:space="preserve">Infrastructure as Code (IaC): </w:t>
+        <w:t>Infrastructure as Code (</w:t>
+      </w:r>
+      <w:proofErr w:type="spellStart"/>
+      <w:r>
+        <w:rPr>
+          <w:rFonts w:ascii="Arial" w:eastAsia="Arial" w:hAnsi="Arial" w:cs="Arial"/>
+          <w:b/>
+          <w:bCs/>
+          <w:sz w:val="18"/>
+          <w:szCs w:val="18"/>
+        </w:rPr>
+        <w:t>IaC</w:t>
+      </w:r>
+      <w:proofErr w:type="spellEnd"/>
+      <w:r>
+        <w:rPr>
+          <w:rFonts w:ascii="Arial" w:eastAsia="Arial" w:hAnsi="Arial" w:cs="Arial"/>
+          <w:b/>
+          <w:bCs/>
+          <w:sz w:val="18"/>
+          <w:szCs w:val="18"/>
+        </w:rPr>
+        <w:t xml:space="preserve">): </w:t>
       </w:r>
       <w:r>
         <w:rPr>
@@ -465,13 +545,23 @@
         </w:rPr>
         <w:t xml:space="preserve">Terraform, </w:t>
       </w:r>
-      <w:r>
-        <w:rPr>
-          <w:rFonts w:ascii="Arial" w:eastAsia="Arial" w:hAnsi="Arial" w:cs="Arial"/>
-          <w:sz w:val="18"/>
-          <w:szCs w:val="18"/>
-        </w:rPr>
-        <w:t xml:space="preserve">Terragrunt, </w:t>
+      <w:proofErr w:type="spellStart"/>
+      <w:r>
+        <w:rPr>
+          <w:rFonts w:ascii="Arial" w:eastAsia="Arial" w:hAnsi="Arial" w:cs="Arial"/>
+          <w:sz w:val="18"/>
+          <w:szCs w:val="18"/>
+        </w:rPr>
+        <w:t>Terragrunt</w:t>
+      </w:r>
+      <w:proofErr w:type="spellEnd"/>
+      <w:r>
+        <w:rPr>
+          <w:rFonts w:ascii="Arial" w:eastAsia="Arial" w:hAnsi="Arial" w:cs="Arial"/>
+          <w:sz w:val="18"/>
+          <w:szCs w:val="18"/>
+        </w:rPr>
+        <w:t xml:space="preserve">, </w:t>
       </w:r>
       <w:r>
         <w:rPr>
@@ -511,7 +601,43 @@
           <w:sz w:val="18"/>
           <w:szCs w:val="18"/>
         </w:rPr>
-        <w:t xml:space="preserve"> FastAPI, Flask, Django, React, Next.js, Streamlit, Celery, REST APIs</w:t>
+        <w:t xml:space="preserve"> </w:t>
+      </w:r>
+      <w:proofErr w:type="spellStart"/>
+      <w:r>
+        <w:rPr>
+          <w:rFonts w:ascii="Arial" w:eastAsia="Arial" w:hAnsi="Arial" w:cs="Arial"/>
+          <w:sz w:val="18"/>
+          <w:szCs w:val="18"/>
+        </w:rPr>
+        <w:t>FastAPI</w:t>
+      </w:r>
+      <w:proofErr w:type="spellEnd"/>
+      <w:r>
+        <w:rPr>
+          <w:rFonts w:ascii="Arial" w:eastAsia="Arial" w:hAnsi="Arial" w:cs="Arial"/>
+          <w:sz w:val="18"/>
+          <w:szCs w:val="18"/>
+        </w:rPr>
+        <w:t xml:space="preserve">, Flask, Django, React, Next.js, </w:t>
+      </w:r>
+      <w:proofErr w:type="spellStart"/>
+      <w:r>
+        <w:rPr>
+          <w:rFonts w:ascii="Arial" w:eastAsia="Arial" w:hAnsi="Arial" w:cs="Arial"/>
+          <w:sz w:val="18"/>
+          <w:szCs w:val="18"/>
+        </w:rPr>
+        <w:t>Streamlit</w:t>
+      </w:r>
+      <w:proofErr w:type="spellEnd"/>
+      <w:r>
+        <w:rPr>
+          <w:rFonts w:ascii="Arial" w:eastAsia="Arial" w:hAnsi="Arial" w:cs="Arial"/>
+          <w:sz w:val="18"/>
+          <w:szCs w:val="18"/>
+        </w:rPr>
+        <w:t>, Celery, REST APIs</w:t>
       </w:r>
     </w:p>
     <w:p>
@@ -543,7 +669,16 @@
           <w:sz w:val="18"/>
           <w:szCs w:val="18"/>
         </w:rPr>
-        <w:t>PostgreSQL, MongoDB, DynamoDB, MySQL, Redis, Neo4j, Amazon Redshift, Click</w:t>
+        <w:t xml:space="preserve">PostgreSQL, MongoDB, DynamoDB, MySQL, Redis, Neo4j, Amazon Redshift, </w:t>
+      </w:r>
+      <w:proofErr w:type="spellStart"/>
+      <w:r>
+        <w:rPr>
+          <w:rFonts w:ascii="Arial" w:eastAsia="Arial" w:hAnsi="Arial" w:cs="Arial"/>
+          <w:sz w:val="18"/>
+          <w:szCs w:val="18"/>
+        </w:rPr>
+        <w:t>Click</w:t>
       </w:r>
       <w:r>
         <w:rPr>
@@ -561,6 +696,7 @@
         </w:rPr>
         <w:t>ouse</w:t>
       </w:r>
+      <w:proofErr w:type="spellEnd"/>
     </w:p>
     <w:p>
       <w:pPr>
@@ -591,8 +727,54 @@
           <w:sz w:val="18"/>
           <w:szCs w:val="18"/>
         </w:rPr>
-        <w:t>Kubernetes, Docker, Helm, Istio Service Mesh, Cilium, ArgoCD, Kustomize, ApplicationSets</w:t>
-      </w:r>
+        <w:t xml:space="preserve">Kubernetes, Docker, Helm, Istio Service Mesh, Cilium, </w:t>
+      </w:r>
+      <w:proofErr w:type="spellStart"/>
+      <w:r>
+        <w:rPr>
+          <w:rFonts w:ascii="Arial" w:eastAsia="Arial" w:hAnsi="Arial" w:cs="Arial"/>
+          <w:sz w:val="18"/>
+          <w:szCs w:val="18"/>
+        </w:rPr>
+        <w:t>ArgoCD</w:t>
+      </w:r>
+      <w:proofErr w:type="spellEnd"/>
+      <w:r>
+        <w:rPr>
+          <w:rFonts w:ascii="Arial" w:eastAsia="Arial" w:hAnsi="Arial" w:cs="Arial"/>
+          <w:sz w:val="18"/>
+          <w:szCs w:val="18"/>
+        </w:rPr>
+        <w:t xml:space="preserve">, </w:t>
+      </w:r>
+      <w:proofErr w:type="spellStart"/>
+      <w:r>
+        <w:rPr>
+          <w:rFonts w:ascii="Arial" w:eastAsia="Arial" w:hAnsi="Arial" w:cs="Arial"/>
+          <w:sz w:val="18"/>
+          <w:szCs w:val="18"/>
+        </w:rPr>
+        <w:t>Kustomize</w:t>
+      </w:r>
+      <w:proofErr w:type="spellEnd"/>
+      <w:r>
+        <w:rPr>
+          <w:rFonts w:ascii="Arial" w:eastAsia="Arial" w:hAnsi="Arial" w:cs="Arial"/>
+          <w:sz w:val="18"/>
+          <w:szCs w:val="18"/>
+        </w:rPr>
+        <w:t xml:space="preserve">, </w:t>
+      </w:r>
+      <w:proofErr w:type="spellStart"/>
+      <w:r>
+        <w:rPr>
+          <w:rFonts w:ascii="Arial" w:eastAsia="Arial" w:hAnsi="Arial" w:cs="Arial"/>
+          <w:sz w:val="18"/>
+          <w:szCs w:val="18"/>
+        </w:rPr>
+        <w:t>ApplicationSets</w:t>
+      </w:r>
+      <w:proofErr w:type="spellEnd"/>
     </w:p>
     <w:p>
       <w:pPr>
@@ -688,8 +870,36 @@
           <w:sz w:val="18"/>
           <w:szCs w:val="18"/>
         </w:rPr>
-        <w:t>Prometheus, Thanos, Loki, Grafana, Mimir, Elasticsearch, OpenTelemetry, Datadog, PagerDuty, OpenCost</w:t>
-      </w:r>
+        <w:t xml:space="preserve">Prometheus, Thanos, Loki, Grafana, Mimir, Elasticsearch, </w:t>
+      </w:r>
+      <w:proofErr w:type="spellStart"/>
+      <w:r>
+        <w:rPr>
+          <w:rFonts w:ascii="Arial" w:eastAsia="Arial" w:hAnsi="Arial" w:cs="Arial"/>
+          <w:sz w:val="18"/>
+          <w:szCs w:val="18"/>
+        </w:rPr>
+        <w:t>OpenTelemetry</w:t>
+      </w:r>
+      <w:proofErr w:type="spellEnd"/>
+      <w:r>
+        <w:rPr>
+          <w:rFonts w:ascii="Arial" w:eastAsia="Arial" w:hAnsi="Arial" w:cs="Arial"/>
+          <w:sz w:val="18"/>
+          <w:szCs w:val="18"/>
+        </w:rPr>
+        <w:t xml:space="preserve">, Datadog, PagerDuty, </w:t>
+      </w:r>
+      <w:proofErr w:type="spellStart"/>
+      <w:r>
+        <w:rPr>
+          <w:rFonts w:ascii="Arial" w:eastAsia="Arial" w:hAnsi="Arial" w:cs="Arial"/>
+          <w:sz w:val="18"/>
+          <w:szCs w:val="18"/>
+        </w:rPr>
+        <w:t>OpenCost</w:t>
+      </w:r>
+      <w:proofErr w:type="spellEnd"/>
     </w:p>
     <w:p>
       <w:pPr>
@@ -715,13 +925,41 @@
         </w:rPr>
         <w:t xml:space="preserve">Security &amp; Compliance: </w:t>
       </w:r>
-      <w:r>
-        <w:rPr>
-          <w:rFonts w:ascii="Arial" w:eastAsia="Arial" w:hAnsi="Arial" w:cs="Arial"/>
-          <w:sz w:val="18"/>
-          <w:szCs w:val="18"/>
-        </w:rPr>
-        <w:t xml:space="preserve">ModSecurity/OWASP CRS, ESO, SOPS, Trivy, </w:t>
+      <w:proofErr w:type="spellStart"/>
+      <w:r>
+        <w:rPr>
+          <w:rFonts w:ascii="Arial" w:eastAsia="Arial" w:hAnsi="Arial" w:cs="Arial"/>
+          <w:sz w:val="18"/>
+          <w:szCs w:val="18"/>
+        </w:rPr>
+        <w:t>ModSecurity</w:t>
+      </w:r>
+      <w:proofErr w:type="spellEnd"/>
+      <w:r>
+        <w:rPr>
+          <w:rFonts w:ascii="Arial" w:eastAsia="Arial" w:hAnsi="Arial" w:cs="Arial"/>
+          <w:sz w:val="18"/>
+          <w:szCs w:val="18"/>
+        </w:rPr>
+        <w:t xml:space="preserve">/OWASP CRS, ESO, SOPS, </w:t>
+      </w:r>
+      <w:proofErr w:type="spellStart"/>
+      <w:r>
+        <w:rPr>
+          <w:rFonts w:ascii="Arial" w:eastAsia="Arial" w:hAnsi="Arial" w:cs="Arial"/>
+          <w:sz w:val="18"/>
+          <w:szCs w:val="18"/>
+        </w:rPr>
+        <w:t>Trivy</w:t>
+      </w:r>
+      <w:proofErr w:type="spellEnd"/>
+      <w:r>
+        <w:rPr>
+          <w:rFonts w:ascii="Arial" w:eastAsia="Arial" w:hAnsi="Arial" w:cs="Arial"/>
+          <w:sz w:val="18"/>
+          <w:szCs w:val="18"/>
+        </w:rPr>
+        <w:t xml:space="preserve">, </w:t>
       </w:r>
       <w:r>
         <w:rPr>
@@ -810,7 +1048,25 @@
           <w:sz w:val="18"/>
           <w:szCs w:val="18"/>
         </w:rPr>
-        <w:t xml:space="preserve">Claude &amp; OpenAI SDK, Multi-Agent Orchestration, MCP, LangChain, </w:t>
+        <w:t xml:space="preserve">Claude &amp; OpenAI SDK, Multi-Agent Orchestration, MCP, </w:t>
+      </w:r>
+      <w:proofErr w:type="spellStart"/>
+      <w:r>
+        <w:rPr>
+          <w:rFonts w:ascii="Arial" w:eastAsia="Arial" w:hAnsi="Arial" w:cs="Arial"/>
+          <w:sz w:val="18"/>
+          <w:szCs w:val="18"/>
+        </w:rPr>
+        <w:t>LangChain</w:t>
+      </w:r>
+      <w:proofErr w:type="spellEnd"/>
+      <w:r>
+        <w:rPr>
+          <w:rFonts w:ascii="Arial" w:eastAsia="Arial" w:hAnsi="Arial" w:cs="Arial"/>
+          <w:sz w:val="18"/>
+          <w:szCs w:val="18"/>
+        </w:rPr>
+        <w:t xml:space="preserve">, </w:t>
       </w:r>
       <w:r>
         <w:rPr>
@@ -869,6 +1125,7 @@
         </w:rPr>
         <w:t xml:space="preserve">Roku                                                                                                                                                                             </w:t>
       </w:r>
+      <w:proofErr w:type="gramStart"/>
       <w:r>
         <w:rPr>
           <w:rFonts w:ascii="Arial" w:eastAsia="Arial" w:hAnsi="Arial" w:cs="Arial"/>
@@ -887,7 +1144,18 @@
           <w:sz w:val="18"/>
           <w:szCs w:val="18"/>
         </w:rPr>
-        <w:t>Boston, MA</w:t>
+        <w:t>Boston</w:t>
+      </w:r>
+      <w:proofErr w:type="gramEnd"/>
+      <w:r>
+        <w:rPr>
+          <w:rFonts w:ascii="Arial" w:eastAsia="Arial" w:hAnsi="Arial" w:cs="Arial"/>
+          <w:i/>
+          <w:iCs/>
+          <w:sz w:val="18"/>
+          <w:szCs w:val="18"/>
+        </w:rPr>
+        <w:t>, MA</w:t>
       </w:r>
     </w:p>
     <w:p>
@@ -917,7 +1185,29 @@
           <w:sz w:val="18"/>
           <w:szCs w:val="18"/>
         </w:rPr>
-        <w:t xml:space="preserve"> | Kubernetes, AWS, ArgoCD, AI Agents                                            </w:t>
+        <w:t xml:space="preserve"> | Kubernetes, AWS, </w:t>
+      </w:r>
+      <w:proofErr w:type="spellStart"/>
+      <w:r>
+        <w:rPr>
+          <w:rFonts w:ascii="Arial" w:eastAsia="Arial" w:hAnsi="Arial" w:cs="Arial"/>
+          <w:i/>
+          <w:iCs/>
+          <w:sz w:val="18"/>
+          <w:szCs w:val="18"/>
+        </w:rPr>
+        <w:t>ArgoCD</w:t>
+      </w:r>
+      <w:proofErr w:type="spellEnd"/>
+      <w:r>
+        <w:rPr>
+          <w:rFonts w:ascii="Arial" w:eastAsia="Arial" w:hAnsi="Arial" w:cs="Arial"/>
+          <w:i/>
+          <w:iCs/>
+          <w:sz w:val="18"/>
+          <w:szCs w:val="18"/>
+        </w:rPr>
+        <w:t xml:space="preserve">, AI Agents                                            </w:t>
       </w:r>
       <w:r>
         <w:rPr>
@@ -1027,7 +1317,79 @@
           <w:sz w:val="18"/>
           <w:szCs w:val="18"/>
         </w:rPr>
-        <w:t>Replaced pipeline-driven deploys with GitOps across the platform: stood up ArgoCD, onboarded every owned service, and moved continuous delivery out of GitLab CI into declarative ApplicationSets - cutting release lead time, making rollback a git revert, and surfacing configuration drift in real time rather than at the next incident.</w:t>
+        <w:t xml:space="preserve">Replaced pipeline-driven deploys with </w:t>
+      </w:r>
+      <w:proofErr w:type="spellStart"/>
+      <w:r>
+        <w:rPr>
+          <w:rFonts w:ascii="Arial" w:hAnsi="Arial" w:cs="Arial"/>
+          <w:sz w:val="18"/>
+          <w:szCs w:val="18"/>
+        </w:rPr>
+        <w:t>GitOps</w:t>
+      </w:r>
+      <w:proofErr w:type="spellEnd"/>
+      <w:r>
+        <w:rPr>
+          <w:rFonts w:ascii="Arial" w:hAnsi="Arial" w:cs="Arial"/>
+          <w:sz w:val="18"/>
+          <w:szCs w:val="18"/>
+        </w:rPr>
+        <w:t xml:space="preserve"> across the </w:t>
+      </w:r>
+      <w:proofErr w:type="gramStart"/>
+      <w:r>
+        <w:rPr>
+          <w:rFonts w:ascii="Arial" w:hAnsi="Arial" w:cs="Arial"/>
+          <w:sz w:val="18"/>
+          <w:szCs w:val="18"/>
+        </w:rPr>
+        <w:t>platform:</w:t>
+      </w:r>
+      <w:proofErr w:type="gramEnd"/>
+      <w:r>
+        <w:rPr>
+          <w:rFonts w:ascii="Arial" w:hAnsi="Arial" w:cs="Arial"/>
+          <w:sz w:val="18"/>
+          <w:szCs w:val="18"/>
+        </w:rPr>
+        <w:t xml:space="preserve"> stood up </w:t>
+      </w:r>
+      <w:proofErr w:type="spellStart"/>
+      <w:r>
+        <w:rPr>
+          <w:rFonts w:ascii="Arial" w:hAnsi="Arial" w:cs="Arial"/>
+          <w:sz w:val="18"/>
+          <w:szCs w:val="18"/>
+        </w:rPr>
+        <w:t>ArgoCD</w:t>
+      </w:r>
+      <w:proofErr w:type="spellEnd"/>
+      <w:r>
+        <w:rPr>
+          <w:rFonts w:ascii="Arial" w:hAnsi="Arial" w:cs="Arial"/>
+          <w:sz w:val="18"/>
+          <w:szCs w:val="18"/>
+        </w:rPr>
+        <w:t xml:space="preserve">, onboarded every owned service, and moved continuous delivery out of GitLab CI into declarative </w:t>
+      </w:r>
+      <w:proofErr w:type="spellStart"/>
+      <w:r>
+        <w:rPr>
+          <w:rFonts w:ascii="Arial" w:hAnsi="Arial" w:cs="Arial"/>
+          <w:sz w:val="18"/>
+          <w:szCs w:val="18"/>
+        </w:rPr>
+        <w:t>ApplicationSets</w:t>
+      </w:r>
+      <w:proofErr w:type="spellEnd"/>
+      <w:r>
+        <w:rPr>
+          <w:rFonts w:ascii="Arial" w:hAnsi="Arial" w:cs="Arial"/>
+          <w:sz w:val="18"/>
+          <w:szCs w:val="18"/>
+        </w:rPr>
+        <w:t xml:space="preserve"> - cutting release lead time, making rollback a git revert, and surfacing configuration drift in real time rather than at the next incident.</w:t>
       </w:r>
     </w:p>
     <w:p>
@@ -1073,7 +1435,43 @@
           <w:sz w:val="18"/>
           <w:szCs w:val="18"/>
         </w:rPr>
-        <w:t>Surfaced $200K+ in annual cloud savings by building a per-workload cost platform on OpenCost with AWS Cost and Usage Reports and spot pricing feeds through Glue and Athena, then acting on it - integrating kube-green to idle non-production workloads off-hours and moving eligible dev and QA fleets onto spot instances.</w:t>
+        <w:t xml:space="preserve">Surfaced $200K+ in annual cloud savings by building a per-workload cost platform on </w:t>
+      </w:r>
+      <w:proofErr w:type="spellStart"/>
+      <w:r>
+        <w:rPr>
+          <w:rFonts w:ascii="Arial" w:hAnsi="Arial" w:cs="Arial"/>
+          <w:sz w:val="18"/>
+          <w:szCs w:val="18"/>
+        </w:rPr>
+        <w:t>OpenCost</w:t>
+      </w:r>
+      <w:proofErr w:type="spellEnd"/>
+      <w:r>
+        <w:rPr>
+          <w:rFonts w:ascii="Arial" w:hAnsi="Arial" w:cs="Arial"/>
+          <w:sz w:val="18"/>
+          <w:szCs w:val="18"/>
+        </w:rPr>
+        <w:t xml:space="preserve"> with AWS Cost and Usage Reports and spot pricing feeds through Glue and Athena, then acting on it - integrating </w:t>
+      </w:r>
+      <w:proofErr w:type="spellStart"/>
+      <w:r>
+        <w:rPr>
+          <w:rFonts w:ascii="Arial" w:hAnsi="Arial" w:cs="Arial"/>
+          <w:sz w:val="18"/>
+          <w:szCs w:val="18"/>
+        </w:rPr>
+        <w:t>kube</w:t>
+      </w:r>
+      <w:proofErr w:type="spellEnd"/>
+      <w:r>
+        <w:rPr>
+          <w:rFonts w:ascii="Arial" w:hAnsi="Arial" w:cs="Arial"/>
+          <w:sz w:val="18"/>
+          <w:szCs w:val="18"/>
+        </w:rPr>
+        <w:t>-green to idle non-production workloads off-hours and moving eligible dev and QA fleets onto spot instances.</w:t>
       </w:r>
     </w:p>
     <w:p>
@@ -1119,7 +1517,25 @@
           <w:sz w:val="18"/>
           <w:szCs w:val="18"/>
         </w:rPr>
-        <w:t>Turned vulnerability response from a multi-team investigation into a single query by modelling the full supply chain in Neo4j and ClickHouse - developer commit, GitLab build, runner, Artifactory publish, Xray scan, cluster, namespace - so any CVE traces to who published it, what built it, and every place it runs.</w:t>
+        <w:t xml:space="preserve">Turned vulnerability response from a multi-team investigation into a single query by modelling the full supply chain in Neo4j and </w:t>
+      </w:r>
+      <w:proofErr w:type="spellStart"/>
+      <w:r>
+        <w:rPr>
+          <w:rFonts w:ascii="Arial" w:hAnsi="Arial" w:cs="Arial"/>
+          <w:sz w:val="18"/>
+          <w:szCs w:val="18"/>
+        </w:rPr>
+        <w:t>ClickHouse</w:t>
+      </w:r>
+      <w:proofErr w:type="spellEnd"/>
+      <w:r>
+        <w:rPr>
+          <w:rFonts w:ascii="Arial" w:hAnsi="Arial" w:cs="Arial"/>
+          <w:sz w:val="18"/>
+          <w:szCs w:val="18"/>
+        </w:rPr>
+        <w:t xml:space="preserve"> - developer commit, GitLab build, runner, Artifactory publish, Xray scan, cluster, namespace - so any CVE traces to who published it, what built it, and every place it runs.</w:t>
       </w:r>
     </w:p>
     <w:p>
@@ -1142,7 +1558,25 @@
           <w:sz w:val="18"/>
           <w:szCs w:val="18"/>
         </w:rPr>
-        <w:t>Cut mean time to resolution 40% by building TicketOps, a Claude multi-agent system that triages incoming tickets, dispatches Kubernetes, observability and code agents, and opens merge requests with proposed fixes for human review.</w:t>
+        <w:t xml:space="preserve">Cut mean time to resolution 40% by building </w:t>
+      </w:r>
+      <w:proofErr w:type="spellStart"/>
+      <w:r>
+        <w:rPr>
+          <w:rFonts w:ascii="Arial" w:hAnsi="Arial" w:cs="Arial"/>
+          <w:sz w:val="18"/>
+          <w:szCs w:val="18"/>
+        </w:rPr>
+        <w:t>TicketOps</w:t>
+      </w:r>
+      <w:proofErr w:type="spellEnd"/>
+      <w:r>
+        <w:rPr>
+          <w:rFonts w:ascii="Arial" w:hAnsi="Arial" w:cs="Arial"/>
+          <w:sz w:val="18"/>
+          <w:szCs w:val="18"/>
+        </w:rPr>
+        <w:t>, a Claude multi-agent system that triages incoming tickets, dispatches Kubernetes, observability and code agents, and opens merge requests with proposed fixes for human review.</w:t>
       </w:r>
     </w:p>
     <w:p>
@@ -1165,7 +1599,43 @@
           <w:sz w:val="18"/>
           <w:szCs w:val="18"/>
         </w:rPr>
-        <w:t>Put root-cause analysis in front of engineers where they already work, building the findings API, per-environment ApplicationSets and scoped analyzer RBAC that route cluster failures through an internal LLM gateway and render plain-language diagnoses beside the owning application in ArgoCD.</w:t>
+        <w:t xml:space="preserve">Put root-cause analysis in front of engineers where they already work, building the findings API, per-environment </w:t>
+      </w:r>
+      <w:proofErr w:type="spellStart"/>
+      <w:r>
+        <w:rPr>
+          <w:rFonts w:ascii="Arial" w:hAnsi="Arial" w:cs="Arial"/>
+          <w:sz w:val="18"/>
+          <w:szCs w:val="18"/>
+        </w:rPr>
+        <w:t>ApplicationSets</w:t>
+      </w:r>
+      <w:proofErr w:type="spellEnd"/>
+      <w:r>
+        <w:rPr>
+          <w:rFonts w:ascii="Arial" w:hAnsi="Arial" w:cs="Arial"/>
+          <w:sz w:val="18"/>
+          <w:szCs w:val="18"/>
+        </w:rPr>
+        <w:t xml:space="preserve"> and scoped analyzer RBAC that route cluster failures through an internal LLM gateway and render plain-language diagnoses beside the owning application in </w:t>
+      </w:r>
+      <w:proofErr w:type="spellStart"/>
+      <w:r>
+        <w:rPr>
+          <w:rFonts w:ascii="Arial" w:hAnsi="Arial" w:cs="Arial"/>
+          <w:sz w:val="18"/>
+          <w:szCs w:val="18"/>
+        </w:rPr>
+        <w:t>ArgoCD</w:t>
+      </w:r>
+      <w:proofErr w:type="spellEnd"/>
+      <w:r>
+        <w:rPr>
+          <w:rFonts w:ascii="Arial" w:hAnsi="Arial" w:cs="Arial"/>
+          <w:sz w:val="18"/>
+          <w:szCs w:val="18"/>
+        </w:rPr>
+        <w:t>.</w:t>
       </w:r>
     </w:p>
     <w:p>
@@ -1314,7 +1784,43 @@
           <w:sz w:val="18"/>
           <w:szCs w:val="18"/>
         </w:rPr>
-        <w:t xml:space="preserve">Removed long-lived runner credentials from infrastructure code by migrating CI runner fleets from Terraform to ArgoCD GitOps, sourcing tokens at runtime from AWS Secrets Manager via External Secrets Operator so rotation became a secret update instead of a redeploy across </w:t>
+        <w:t xml:space="preserve">Removed long-lived runner credentials from infrastructure code by migrating CI runner fleets from Terraform to </w:t>
+      </w:r>
+      <w:proofErr w:type="spellStart"/>
+      <w:r>
+        <w:rPr>
+          <w:rFonts w:ascii="Arial" w:hAnsi="Arial" w:cs="Arial"/>
+          <w:sz w:val="18"/>
+          <w:szCs w:val="18"/>
+        </w:rPr>
+        <w:t>ArgoCD</w:t>
+      </w:r>
+      <w:proofErr w:type="spellEnd"/>
+      <w:r>
+        <w:rPr>
+          <w:rFonts w:ascii="Arial" w:hAnsi="Arial" w:cs="Arial"/>
+          <w:sz w:val="18"/>
+          <w:szCs w:val="18"/>
+        </w:rPr>
+        <w:t xml:space="preserve"> </w:t>
+      </w:r>
+      <w:proofErr w:type="spellStart"/>
+      <w:r>
+        <w:rPr>
+          <w:rFonts w:ascii="Arial" w:hAnsi="Arial" w:cs="Arial"/>
+          <w:sz w:val="18"/>
+          <w:szCs w:val="18"/>
+        </w:rPr>
+        <w:t>GitOps</w:t>
+      </w:r>
+      <w:proofErr w:type="spellEnd"/>
+      <w:r>
+        <w:rPr>
+          <w:rFonts w:ascii="Arial" w:hAnsi="Arial" w:cs="Arial"/>
+          <w:sz w:val="18"/>
+          <w:szCs w:val="18"/>
+        </w:rPr>
+        <w:t xml:space="preserve">, sourcing tokens at runtime from AWS Secrets Manager via External Secrets Operator so rotation became a secret update instead of a redeploy across </w:t>
       </w:r>
       <w:r>
         <w:rPr>
@@ -1353,7 +1859,25 @@
           <w:sz w:val="18"/>
           <w:szCs w:val="18"/>
         </w:rPr>
-        <w:t>Reduced alert noise 60% and incident response time 35% with an alerting-as-code framework on ArgoCD Notifications and Terraform, routing PagerDuty, Slack and email with team-based RBAC.</w:t>
+        <w:t xml:space="preserve">Reduced alert noise 60% and incident response time 35% with an alerting-as-code framework on </w:t>
+      </w:r>
+      <w:proofErr w:type="spellStart"/>
+      <w:r>
+        <w:rPr>
+          <w:rFonts w:ascii="Arial" w:hAnsi="Arial" w:cs="Arial"/>
+          <w:sz w:val="18"/>
+          <w:szCs w:val="18"/>
+        </w:rPr>
+        <w:t>ArgoCD</w:t>
+      </w:r>
+      <w:proofErr w:type="spellEnd"/>
+      <w:r>
+        <w:rPr>
+          <w:rFonts w:ascii="Arial" w:hAnsi="Arial" w:cs="Arial"/>
+          <w:sz w:val="18"/>
+          <w:szCs w:val="18"/>
+        </w:rPr>
+        <w:t xml:space="preserve"> Notifications and Terraform, routing PagerDuty, Slack and email with team-based RBAC.</w:t>
       </w:r>
     </w:p>
     <w:p>
@@ -1376,7 +1900,25 @@
           <w:sz w:val="18"/>
           <w:szCs w:val="18"/>
         </w:rPr>
-        <w:t>Ended stale-rotation pages for 20+ engineering teams by building a PagerDuty-to-Slack sync service that keeps each team's Slack handle resolved to whoever is actually on call.</w:t>
+        <w:t xml:space="preserve">Ended stale-rotation pages for 20+ engineering teams by building a PagerDuty-to-Slack sync service that keeps each team's Slack handle resolved to whoever is </w:t>
+      </w:r>
+      <w:proofErr w:type="gramStart"/>
+      <w:r>
+        <w:rPr>
+          <w:rFonts w:ascii="Arial" w:hAnsi="Arial" w:cs="Arial"/>
+          <w:sz w:val="18"/>
+          <w:szCs w:val="18"/>
+        </w:rPr>
+        <w:t>actually on</w:t>
+      </w:r>
+      <w:proofErr w:type="gramEnd"/>
+      <w:r>
+        <w:rPr>
+          <w:rFonts w:ascii="Arial" w:hAnsi="Arial" w:cs="Arial"/>
+          <w:sz w:val="18"/>
+          <w:szCs w:val="18"/>
+        </w:rPr>
+        <w:t xml:space="preserve"> call.</w:t>
       </w:r>
     </w:p>
     <w:p>
@@ -1399,7 +1941,25 @@
           <w:sz w:val="18"/>
           <w:szCs w:val="18"/>
         </w:rPr>
-        <w:t>Cut CI/CD pipeline debugging time 50% with MeshTrace, a distributed tracing tool that follows a CI job across the service mesh, ingress and artifact backends.</w:t>
+        <w:t xml:space="preserve">Cut CI/CD pipeline debugging time 50% with </w:t>
+      </w:r>
+      <w:proofErr w:type="spellStart"/>
+      <w:r>
+        <w:rPr>
+          <w:rFonts w:ascii="Arial" w:hAnsi="Arial" w:cs="Arial"/>
+          <w:sz w:val="18"/>
+          <w:szCs w:val="18"/>
+        </w:rPr>
+        <w:t>MeshTrace</w:t>
+      </w:r>
+      <w:proofErr w:type="spellEnd"/>
+      <w:r>
+        <w:rPr>
+          <w:rFonts w:ascii="Arial" w:hAnsi="Arial" w:cs="Arial"/>
+          <w:sz w:val="18"/>
+          <w:szCs w:val="18"/>
+        </w:rPr>
+        <w:t>, a distributed tracing tool that follows a CI job across the service mesh, ingress and artifact backends.</w:t>
       </w:r>
     </w:p>
     <w:p>
@@ -1423,7 +1983,25 @@
           <w:szCs w:val="18"/>
         </w:rPr>
         <w:lastRenderedPageBreak/>
-        <w:t>Removed a recurring class of pipeline outages by building a token lifecycle platform (FastAPI, React, PostgreSQL) that discovers every personal, group and project access token, alerts owners ahead of expiry, and surfaces stale credentials for revocation.</w:t>
+        <w:t>Removed a recurring class of pipeline outages by building a token lifecycle platform (</w:t>
+      </w:r>
+      <w:proofErr w:type="spellStart"/>
+      <w:r>
+        <w:rPr>
+          <w:rFonts w:ascii="Arial" w:hAnsi="Arial" w:cs="Arial"/>
+          <w:sz w:val="18"/>
+          <w:szCs w:val="18"/>
+        </w:rPr>
+        <w:t>FastAPI</w:t>
+      </w:r>
+      <w:proofErr w:type="spellEnd"/>
+      <w:r>
+        <w:rPr>
+          <w:rFonts w:ascii="Arial" w:hAnsi="Arial" w:cs="Arial"/>
+          <w:sz w:val="18"/>
+          <w:szCs w:val="18"/>
+        </w:rPr>
+        <w:t>, React, PostgreSQL) that discovers every personal, group and project access token, alerts owners ahead of expiry, and surfaces stale credentials for revocation.</w:t>
       </w:r>
     </w:p>
     <w:p>
@@ -1433,6 +2011,7 @@
         </w:tabs>
         <w:spacing w:before="100"/>
       </w:pPr>
+      <w:proofErr w:type="spellStart"/>
       <w:r>
         <w:rPr>
           <w:rFonts w:ascii="Arial" w:eastAsia="Arial" w:hAnsi="Arial" w:cs="Arial"/>
@@ -1440,7 +2019,17 @@
           <w:bCs/>
           <w:color w:val="1E5CA8"/>
         </w:rPr>
-        <w:t xml:space="preserve">Perfios                                                                                                                                                                     </w:t>
+        <w:t>Perfios</w:t>
+      </w:r>
+      <w:proofErr w:type="spellEnd"/>
+      <w:r>
+        <w:rPr>
+          <w:rFonts w:ascii="Arial" w:eastAsia="Arial" w:hAnsi="Arial" w:cs="Arial"/>
+          <w:b/>
+          <w:bCs/>
+          <w:color w:val="1E5CA8"/>
+        </w:rPr>
+        <w:t xml:space="preserve">                                                                                                                                                                     </w:t>
       </w:r>
       <w:r>
         <w:rPr>
@@ -1694,7 +2283,33 @@
           <w:sz w:val="18"/>
           <w:szCs w:val="18"/>
         </w:rPr>
-        <w:t>INTERN - R&amp;D AllSight Team</w:t>
+        <w:t xml:space="preserve">INTERN - R&amp;D </w:t>
+      </w:r>
+      <w:proofErr w:type="spellStart"/>
+      <w:r>
+        <w:rPr>
+          <w:rFonts w:ascii="Arial" w:eastAsia="Arial" w:hAnsi="Arial" w:cs="Arial"/>
+          <w:b/>
+          <w:bCs/>
+          <w:i/>
+          <w:iCs/>
+          <w:sz w:val="18"/>
+          <w:szCs w:val="18"/>
+        </w:rPr>
+        <w:t>AllSight</w:t>
+      </w:r>
+      <w:proofErr w:type="spellEnd"/>
+      <w:r>
+        <w:rPr>
+          <w:rFonts w:ascii="Arial" w:eastAsia="Arial" w:hAnsi="Arial" w:cs="Arial"/>
+          <w:b/>
+          <w:bCs/>
+          <w:i/>
+          <w:iCs/>
+          <w:sz w:val="18"/>
+          <w:szCs w:val="18"/>
+        </w:rPr>
+        <w:t xml:space="preserve"> Team</w:t>
       </w:r>
       <w:r>
         <w:rPr>
@@ -1832,7 +2447,29 @@
           <w:sz w:val="18"/>
           <w:szCs w:val="18"/>
         </w:rPr>
-        <w:t xml:space="preserve"> | Python, Javascript, Bash, Kafka, CI/CD                                   </w:t>
+        <w:t xml:space="preserve"> | Python, </w:t>
+      </w:r>
+      <w:proofErr w:type="spellStart"/>
+      <w:r>
+        <w:rPr>
+          <w:rFonts w:ascii="Arial" w:eastAsia="Arial" w:hAnsi="Arial" w:cs="Arial"/>
+          <w:i/>
+          <w:iCs/>
+          <w:sz w:val="18"/>
+          <w:szCs w:val="18"/>
+        </w:rPr>
+        <w:t>Javascript</w:t>
+      </w:r>
+      <w:proofErr w:type="spellEnd"/>
+      <w:r>
+        <w:rPr>
+          <w:rFonts w:ascii="Arial" w:eastAsia="Arial" w:hAnsi="Arial" w:cs="Arial"/>
+          <w:i/>
+          <w:iCs/>
+          <w:sz w:val="18"/>
+          <w:szCs w:val="18"/>
+        </w:rPr>
+        <w:t xml:space="preserve">, Bash, Kafka, CI/CD                                   </w:t>
       </w:r>
       <w:r>
         <w:rPr>
@@ -1915,6 +2552,7 @@
         <w:spacing w:before="100"/>
       </w:pPr>
       <w:bookmarkStart w:id="3" w:name="OLE_LINK5"/>
+      <w:proofErr w:type="spellStart"/>
       <w:r>
         <w:rPr>
           <w:rFonts w:ascii="Arial" w:eastAsia="Arial" w:hAnsi="Arial" w:cs="Arial"/>
@@ -1924,6 +2562,7 @@
         </w:rPr>
         <w:t>TicketOps</w:t>
       </w:r>
+      <w:proofErr w:type="spellEnd"/>
       <w:r>
         <w:rPr>
           <w:rFonts w:ascii="Arial" w:eastAsia="Arial" w:hAnsi="Arial" w:cs="Arial"/>
@@ -2104,6 +2743,7 @@
         </w:rPr>
         <w:t xml:space="preserve">, </w:t>
       </w:r>
+      <w:proofErr w:type="spellStart"/>
       <w:r>
         <w:rPr>
           <w:rFonts w:ascii="Arial" w:eastAsia="Arial" w:hAnsi="Arial" w:cs="Arial"/>
@@ -2114,6 +2754,7 @@
         </w:rPr>
         <w:t>ClickHouse</w:t>
       </w:r>
+      <w:proofErr w:type="spellEnd"/>
       <w:r>
         <w:rPr>
           <w:rFonts w:ascii="Arial" w:eastAsia="Arial" w:hAnsi="Arial" w:cs="Arial"/>
@@ -2132,8 +2773,20 @@
           <w:sz w:val="18"/>
           <w:szCs w:val="18"/>
         </w:rPr>
-        <w:t xml:space="preserve"> Collectors, Gitlab, Artifactory, Xray, Trivy</w:t>
-      </w:r>
+        <w:t xml:space="preserve"> Collectors, Gitlab, Artifactory, Xray, </w:t>
+      </w:r>
+      <w:proofErr w:type="spellStart"/>
+      <w:r>
+        <w:rPr>
+          <w:rFonts w:ascii="Arial" w:eastAsia="Arial" w:hAnsi="Arial" w:cs="Arial"/>
+          <w:i/>
+          <w:iCs/>
+          <w:sz w:val="18"/>
+          <w:szCs w:val="18"/>
+        </w:rPr>
+        <w:t>Trivy</w:t>
+      </w:r>
+      <w:proofErr w:type="spellEnd"/>
       <w:r>
         <w:rPr>
           <w:rFonts w:ascii="Arial" w:eastAsia="Arial" w:hAnsi="Arial" w:cs="Arial"/>
@@ -2162,7 +2815,27 @@
           <w:sz w:val="18"/>
           <w:szCs w:val="18"/>
         </w:rPr>
-        <w:t>Models the full software supply chain in Neo4j and ClickHouse - developer commit, GitLab build, runner, Artifactory publish, Xray scan, cluster and namespace - so a CVE or vulnerable package can be traced to who published it, what built it, and every place it runs.</w:t>
+        <w:t xml:space="preserve">Models the full software supply chain in Neo4j and </w:t>
+      </w:r>
+      <w:proofErr w:type="spellStart"/>
+      <w:r>
+        <w:rPr>
+          <w:rFonts w:ascii="Arial" w:hAnsi="Arial" w:cs="Arial"/>
+          <w:color w:val="343434"/>
+          <w:sz w:val="18"/>
+          <w:szCs w:val="18"/>
+        </w:rPr>
+        <w:t>ClickHouse</w:t>
+      </w:r>
+      <w:proofErr w:type="spellEnd"/>
+      <w:r>
+        <w:rPr>
+          <w:rFonts w:ascii="Arial" w:hAnsi="Arial" w:cs="Arial"/>
+          <w:color w:val="343434"/>
+          <w:sz w:val="18"/>
+          <w:szCs w:val="18"/>
+        </w:rPr>
+        <w:t xml:space="preserve"> - developer commit, GitLab build, runner, Artifactory publish, Xray scan, cluster and namespace - so a CVE or vulnerable package can be traced to who published it, what built it, and every place it runs.</w:t>
       </w:r>
       <w:bookmarkEnd w:id="5"/>
     </w:p>
@@ -2174,6 +2847,7 @@
         </w:tabs>
         <w:spacing w:before="200"/>
       </w:pPr>
+      <w:proofErr w:type="spellStart"/>
       <w:r>
         <w:rPr>
           <w:rFonts w:ascii="Arial" w:eastAsia="Arial" w:hAnsi="Arial" w:cs="Arial"/>
@@ -2192,6 +2866,7 @@
         </w:rPr>
         <w:t>Deploy</w:t>
       </w:r>
+      <w:proofErr w:type="spellEnd"/>
       <w:r>
         <w:rPr>
           <w:rFonts w:ascii="Arial" w:eastAsia="Arial" w:hAnsi="Arial" w:cs="Arial"/>
@@ -2221,7 +2896,29 @@
           <w:sz w:val="18"/>
           <w:szCs w:val="18"/>
         </w:rPr>
-        <w:t xml:space="preserve"> FastAPI, React, </w:t>
+        <w:t xml:space="preserve"> </w:t>
+      </w:r>
+      <w:proofErr w:type="spellStart"/>
+      <w:r>
+        <w:rPr>
+          <w:rFonts w:ascii="Arial" w:eastAsia="Arial" w:hAnsi="Arial" w:cs="Arial"/>
+          <w:i/>
+          <w:iCs/>
+          <w:sz w:val="18"/>
+          <w:szCs w:val="18"/>
+        </w:rPr>
+        <w:t>FastAPI</w:t>
+      </w:r>
+      <w:proofErr w:type="spellEnd"/>
+      <w:r>
+        <w:rPr>
+          <w:rFonts w:ascii="Arial" w:eastAsia="Arial" w:hAnsi="Arial" w:cs="Arial"/>
+          <w:i/>
+          <w:iCs/>
+          <w:sz w:val="18"/>
+          <w:szCs w:val="18"/>
+        </w:rPr>
+        <w:t xml:space="preserve">, React, </w:t>
       </w:r>
       <w:r>
         <w:rPr>
@@ -2282,7 +2979,27 @@
           <w:sz w:val="18"/>
           <w:szCs w:val="18"/>
         </w:rPr>
-        <w:t>Self-service deployment platform for one-click provisioning of databases, web servers, MCP servers, AI apps and cron jobs on Kubernetes, with JWT/OAuth authentication, resource validation and cost calculation.</w:t>
+        <w:t xml:space="preserve">Self-service deployment platform for one-click provisioning of databases, web servers, MCP servers, AI apps and </w:t>
+      </w:r>
+      <w:proofErr w:type="spellStart"/>
+      <w:r>
+        <w:rPr>
+          <w:rFonts w:ascii="Arial" w:hAnsi="Arial" w:cs="Arial"/>
+          <w:color w:val="343434"/>
+          <w:sz w:val="18"/>
+          <w:szCs w:val="18"/>
+        </w:rPr>
+        <w:t>cron</w:t>
+      </w:r>
+      <w:proofErr w:type="spellEnd"/>
+      <w:r>
+        <w:rPr>
+          <w:rFonts w:ascii="Arial" w:hAnsi="Arial" w:cs="Arial"/>
+          <w:color w:val="343434"/>
+          <w:sz w:val="18"/>
+          <w:szCs w:val="18"/>
+        </w:rPr>
+        <w:t xml:space="preserve"> jobs on Kubernetes, with JWT/OAuth authentication, resource validation and cost calculation.</w:t>
       </w:r>
     </w:p>
     <w:p>
@@ -2357,6 +3074,7 @@
         </w:rPr>
         <w:t xml:space="preserve">M.S. Computer Engineering | Specialization in Data Science | GPA: 3.5                                                                  </w:t>
       </w:r>
+      <w:proofErr w:type="gramStart"/>
       <w:r>
         <w:rPr>
           <w:rFonts w:ascii="Arial" w:eastAsia="Arial" w:hAnsi="Arial" w:cs="Arial"/>
@@ -2378,7 +3096,18 @@
           <w:sz w:val="18"/>
           <w:szCs w:val="18"/>
         </w:rPr>
-        <w:t>Aug 2019 - May 2021</w:t>
+        <w:t>Aug</w:t>
+      </w:r>
+      <w:proofErr w:type="gramEnd"/>
+      <w:r>
+        <w:rPr>
+          <w:rFonts w:ascii="Arial" w:eastAsia="Arial" w:hAnsi="Arial" w:cs="Arial"/>
+          <w:i/>
+          <w:iCs/>
+          <w:sz w:val="18"/>
+          <w:szCs w:val="18"/>
+        </w:rPr>
+        <w:t xml:space="preserve"> 2019 - May 2021</w:t>
       </w:r>
     </w:p>
     <w:p>
@@ -2397,6 +3126,7 @@
         </w:rPr>
         <w:t xml:space="preserve">Pune Vidyarthi Griha's, University of Pune                                                                                                               </w:t>
       </w:r>
+      <w:proofErr w:type="gramStart"/>
       <w:r>
         <w:rPr>
           <w:rFonts w:ascii="Arial" w:eastAsia="Arial" w:hAnsi="Arial" w:cs="Arial"/>
@@ -2415,7 +3145,18 @@
           <w:sz w:val="18"/>
           <w:szCs w:val="18"/>
         </w:rPr>
-        <w:t>Nashik, IN</w:t>
+        <w:t>Nashik</w:t>
+      </w:r>
+      <w:proofErr w:type="gramEnd"/>
+      <w:r>
+        <w:rPr>
+          <w:rFonts w:ascii="Arial" w:eastAsia="Arial" w:hAnsi="Arial" w:cs="Arial"/>
+          <w:i/>
+          <w:iCs/>
+          <w:sz w:val="18"/>
+          <w:szCs w:val="18"/>
+        </w:rPr>
+        <w:t>, IN</w:t>
       </w:r>
     </w:p>
     <w:p>
@@ -2490,6 +3231,7 @@
         </w:rPr>
         <w:t xml:space="preserve">  </w:t>
       </w:r>
+      <w:proofErr w:type="gramStart"/>
       <w:r>
         <w:rPr>
           <w:rFonts w:ascii="Arial" w:eastAsia="Arial" w:hAnsi="Arial" w:cs="Arial"/>
@@ -2511,7 +3253,18 @@
           <w:sz w:val="18"/>
           <w:szCs w:val="18"/>
         </w:rPr>
-        <w:t>May 2012 - May 2017</w:t>
+        <w:t>May</w:t>
+      </w:r>
+      <w:proofErr w:type="gramEnd"/>
+      <w:r>
+        <w:rPr>
+          <w:rFonts w:ascii="Arial" w:eastAsia="Arial" w:hAnsi="Arial" w:cs="Arial"/>
+          <w:i/>
+          <w:iCs/>
+          <w:sz w:val="18"/>
+          <w:szCs w:val="18"/>
+        </w:rPr>
+        <w:t xml:space="preserve"> 2012 - May 2017</w:t>
       </w:r>
     </w:p>
     <w:p>
@@ -2923,16 +3676,18 @@
         </w:rPr>
         <w:t>Filed a patent on "</w:t>
       </w:r>
-      <w:r>
-        <w:rPr>
-          <w:rFonts w:ascii="Arial" w:eastAsia="Arial" w:hAnsi="Arial" w:cs="Arial"/>
-          <w:color w:val="1E5CA8"/>
-          <w:sz w:val="18"/>
-          <w:szCs w:val="18"/>
-          <w:u w:val="single"/>
-        </w:rPr>
-        <w:t>Robust Human Detection &amp; Tracking using Human Model based Camera calibration</w:t>
-      </w:r>
+      <w:hyperlink r:id="rId10" w:history="1">
+        <w:r>
+          <w:rPr>
+            <w:rStyle w:val="Hyperlink"/>
+            <w:rFonts w:ascii="Arial" w:eastAsia="Arial" w:hAnsi="Arial" w:cs="Arial"/>
+            <w:sz w:val="18"/>
+            <w:szCs w:val="18"/>
+            <w:u w:val="none"/>
+          </w:rPr>
+          <w:t>Robust Human Detection &amp; Tracking using Human Model based Camera calibration</w:t>
+        </w:r>
+      </w:hyperlink>
       <w:r>
         <w:rPr>
           <w:rFonts w:ascii="Arial" w:eastAsia="Arial" w:hAnsi="Arial" w:cs="Arial"/>

</xml_diff>